<commit_message>
chore(ag): update system template for afb
</commit_message>
<xml_diff>
--- a/document-merge-service/kt_ag/templatefiles/Kantonale_Fachstelle_Stellungnahme_an_AFB.docx
+++ b/document-merge-service/kt_ag/templatefiles/Kantonale_Fachstelle_Stellungnahme_an_AFB.docx
@@ -29,41 +29,17 @@
             <w:pPr>
               <w:pStyle w:val="AbsenderTitelStufeI"/>
             </w:pPr>
-            <w:r>
-              <w:t xml:space="preserve">{{ </w:t>
-            </w:r>
-          </w:p>
-          <w:p>
-            <w:pPr>
-              <w:pStyle w:val="AbsenderTitelStufeI"/>
-            </w:pPr>
-            <w:r>
-              <w:t>MEINE_ORGANISATION_</w:t>
-            </w:r>
             <w:proofErr w:type="gramStart"/>
             <w:r>
+              <w:t>{{ MEINE</w:t>
+            </w:r>
+            <w:proofErr w:type="gramEnd"/>
+            <w:r>
+              <w:t>_ORGANISATION_</w:t>
+            </w:r>
+            <w:proofErr w:type="gramStart"/>
+            <w:r>
               <w:t>DEPARTEMENT }</w:t>
-            </w:r>
-            <w:proofErr w:type="gramEnd"/>
-            <w:r>
-              <w:t>}</w:t>
-            </w:r>
-          </w:p>
-          <w:p>
-            <w:pPr>
-              <w:pStyle w:val="AbsenderTitelStufeII"/>
-            </w:pPr>
-            <w:proofErr w:type="gramStart"/>
-            <w:r>
-              <w:t>{{ MEINE</w:t>
-            </w:r>
-            <w:proofErr w:type="gramEnd"/>
-            <w:r>
-              <w:t>_ORGANISATION_</w:t>
-            </w:r>
-            <w:proofErr w:type="gramStart"/>
-            <w:r>
-              <w:t>NAME }</w:t>
             </w:r>
             <w:proofErr w:type="gramEnd"/>
             <w:r>
@@ -74,6 +50,38 @@
             <w:pPr>
               <w:pStyle w:val="AbsenderDistanz"/>
             </w:pPr>
+            <w:proofErr w:type="gramStart"/>
+            <w:r>
+              <w:rPr>
+                <w:sz w:val="18"/>
+                <w:szCs w:val="24"/>
+              </w:rPr>
+              <w:t>{{ MEINE</w:t>
+            </w:r>
+            <w:proofErr w:type="gramEnd"/>
+            <w:r>
+              <w:rPr>
+                <w:sz w:val="18"/>
+                <w:szCs w:val="24"/>
+              </w:rPr>
+              <w:t>_ORGANISATION_</w:t>
+            </w:r>
+            <w:proofErr w:type="gramStart"/>
+            <w:r>
+              <w:rPr>
+                <w:sz w:val="18"/>
+                <w:szCs w:val="24"/>
+              </w:rPr>
+              <w:t>NAME }</w:t>
+            </w:r>
+            <w:proofErr w:type="gramEnd"/>
+            <w:r>
+              <w:rPr>
+                <w:sz w:val="18"/>
+                <w:szCs w:val="24"/>
+              </w:rPr>
+              <w:t>}</w:t>
+            </w:r>
           </w:p>
           <w:p>
             <w:pPr>
@@ -87,8 +95,9 @@
                 <w:bCs/>
                 <w:szCs w:val="16"/>
               </w:rPr>
-              <w:t xml:space="preserve">{{ </w:t>
-            </w:r>
+              <w:t>{{ ANGEMELDET</w:t>
+            </w:r>
+            <w:proofErr w:type="gramEnd"/>
             <w:r>
               <w:rPr>
                 <w:rFonts w:eastAsia="Arial" w:cs="Arial"/>
@@ -96,9 +105,9 @@
                 <w:bCs/>
                 <w:szCs w:val="16"/>
               </w:rPr>
-              <w:t>ANGEMELDET</w:t>
-            </w:r>
-            <w:proofErr w:type="gramEnd"/>
+              <w:t>_</w:t>
+            </w:r>
+            <w:proofErr w:type="gramStart"/>
             <w:r>
               <w:rPr>
                 <w:rFonts w:eastAsia="Arial" w:cs="Arial"/>
@@ -106,9 +115,9 @@
                 <w:bCs/>
                 <w:szCs w:val="16"/>
               </w:rPr>
-              <w:t>_</w:t>
-            </w:r>
-            <w:proofErr w:type="gramStart"/>
+              <w:t>NAME }</w:t>
+            </w:r>
+            <w:proofErr w:type="gramEnd"/>
             <w:r>
               <w:rPr>
                 <w:rFonts w:eastAsia="Arial" w:cs="Arial"/>
@@ -116,35 +125,11 @@
                 <w:bCs/>
                 <w:szCs w:val="16"/>
               </w:rPr>
-              <w:t xml:space="preserve">NAME </w:t>
-            </w:r>
-            <w:r>
-              <w:rPr>
-                <w:b/>
-                <w:bCs/>
-              </w:rPr>
-              <w:t>}</w:t>
-            </w:r>
-            <w:proofErr w:type="gramEnd"/>
-            <w:r>
-              <w:rPr>
-                <w:b/>
-                <w:bCs/>
-              </w:rPr>
-              <w:t>}</w:t>
-            </w:r>
-            <w:r>
-              <w:rPr>
-                <w:b/>
-              </w:rPr>
-              <w:t xml:space="preserve">, </w:t>
+              <w:t xml:space="preserve">}, </w:t>
             </w:r>
             <w:proofErr w:type="gramStart"/>
             <w:r>
-              <w:t xml:space="preserve">{{ </w:t>
-            </w:r>
-            <w:r>
-              <w:t>ANGEMELDET</w:t>
+              <w:t>{{ ANGEMELDET</w:t>
             </w:r>
             <w:proofErr w:type="gramEnd"/>
             <w:r>
@@ -165,10 +150,7 @@
             </w:pPr>
             <w:proofErr w:type="gramStart"/>
             <w:r>
-              <w:t xml:space="preserve">{{ </w:t>
-            </w:r>
-            <w:r>
-              <w:t>ANGEMELDET</w:t>
+              <w:t>{{ ANGEMELDET</w:t>
             </w:r>
             <w:proofErr w:type="gramEnd"/>
             <w:r>
@@ -270,14 +252,7 @@
                 <w:rFonts w:eastAsia="Arial" w:cs="Arial"/>
                 <w:szCs w:val="16"/>
               </w:rPr>
-              <w:t xml:space="preserve">{{ </w:t>
-            </w:r>
-            <w:r>
-              <w:rPr>
-                <w:rFonts w:eastAsia="Arial" w:cs="Arial"/>
-                <w:szCs w:val="16"/>
-              </w:rPr>
-              <w:t>ANGEMELDET</w:t>
+              <w:t>{{ ANGEMELDET</w:t>
             </w:r>
             <w:proofErr w:type="gramEnd"/>
             <w:r>
@@ -318,14 +293,7 @@
                 <w:rFonts w:eastAsia="Arial" w:cs="Arial"/>
                 <w:szCs w:val="16"/>
               </w:rPr>
-              <w:t xml:space="preserve">{{ </w:t>
-            </w:r>
-            <w:r>
-              <w:rPr>
-                <w:rFonts w:eastAsia="Arial" w:cs="Arial"/>
-                <w:szCs w:val="16"/>
-              </w:rPr>
-              <w:t>ANGEMELDET</w:t>
+              <w:t>{{ ANGEMELDET</w:t>
             </w:r>
             <w:proofErr w:type="gramEnd"/>
             <w:r>
@@ -355,28 +323,49 @@
           <w:p>
             <w:pPr>
               <w:pStyle w:val="AbsenderText"/>
+            </w:pPr>
+            <w:proofErr w:type="gramStart"/>
+            <w:r>
+              <w:rPr>
+                <w:rFonts w:eastAsia="Arial" w:cs="Arial"/>
+                <w:szCs w:val="16"/>
+              </w:rPr>
+              <w:t>{{ MEINE</w:t>
+            </w:r>
+            <w:proofErr w:type="gramEnd"/>
+            <w:r>
+              <w:rPr>
+                <w:rFonts w:eastAsia="Arial" w:cs="Arial"/>
+                <w:szCs w:val="16"/>
+              </w:rPr>
+              <w:t>_ORGANISATION_</w:t>
+            </w:r>
+            <w:proofErr w:type="gramStart"/>
+            <w:r>
+              <w:rPr>
+                <w:rFonts w:eastAsia="Arial" w:cs="Arial"/>
+                <w:szCs w:val="16"/>
+              </w:rPr>
+              <w:t>WEBSEITE }</w:t>
+            </w:r>
+            <w:proofErr w:type="gramEnd"/>
+            <w:r>
+              <w:rPr>
+                <w:rFonts w:eastAsia="Arial" w:cs="Arial"/>
+                <w:szCs w:val="16"/>
+              </w:rPr>
+              <w:t>}</w:t>
+            </w:r>
+          </w:p>
+          <w:p>
+            <w:pPr>
+              <w:pStyle w:val="AbsenderText"/>
               <w:rPr>
                 <w:rFonts w:eastAsia="Arial" w:cs="Arial"/>
                 <w:color w:val="000000" w:themeColor="text1"/>
                 <w:szCs w:val="16"/>
               </w:rPr>
             </w:pPr>
-            <w:proofErr w:type="gramStart"/>
-            <w:r>
-              <w:rPr>
-                <w:rFonts w:eastAsia="Arial" w:cs="Arial"/>
-                <w:szCs w:val="16"/>
-              </w:rPr>
-              <w:t>{{ MEINE</w:t>
-            </w:r>
-            <w:proofErr w:type="gramEnd"/>
-            <w:r>
-              <w:rPr>
-                <w:rFonts w:eastAsia="Arial" w:cs="Arial"/>
-                <w:szCs w:val="16"/>
-              </w:rPr>
-              <w:t>_ORGANISATION_WEBSEITE }}</w:t>
-            </w:r>
           </w:p>
         </w:tc>
         <w:tc>
@@ -404,11 +393,13 @@
           <w:p>
             <w:pPr>
               <w:rPr>
-                <w:rFonts w:eastAsia="MingLiU" w:hAnsi="MingLiU" w:cs="Arial"/>
+                <w:rFonts w:eastAsia="Arial" w:cs="Arial"/>
+                <w:szCs w:val="20"/>
               </w:rPr>
             </w:pPr>
             <w:r>
               <w:rPr>
+                <w:rFonts w:eastAsia="Arial" w:cs="Arial"/>
                 <w:szCs w:val="20"/>
               </w:rPr>
               <w:t>Abteilung für Baubewilligungen</w:t>
@@ -483,39 +474,16 @@
           </w:p>
         </w:tc>
       </w:tr>
-    </w:tbl>
-    <w:p>
-      <w:pPr>
-        <w:spacing w:line="240" w:lineRule="auto"/>
-        <w:rPr>
-          <w:sz w:val="2"/>
-          <w:szCs w:val="2"/>
-        </w:rPr>
-        <w:sectPr>
-          <w:headerReference w:type="default" r:id="rId11"/>
-          <w:type w:val="continuous"/>
-          <w:pgSz w:w="11906" w:h="16838" w:code="9"/>
-          <w:pgMar w:top="1871" w:right="1134" w:bottom="1134" w:left="1814" w:header="567" w:footer="476" w:gutter="0"/>
-          <w:cols w:space="720"/>
-        </w:sectPr>
-      </w:pPr>
-    </w:p>
-    <w:tbl>
-      <w:tblPr>
-        <w:tblStyle w:val="Template"/>
-        <w:tblW w:w="8959" w:type="dxa"/>
-        <w:tblBorders>
-          <w:bottom w:val="single" w:sz="4" w:space="0" w:color="auto"/>
-        </w:tblBorders>
-        <w:tblLook w:val="04A0" w:firstRow="1" w:lastRow="0" w:firstColumn="1" w:lastColumn="0" w:noHBand="0" w:noVBand="1"/>
-      </w:tblPr>
-      <w:tblGrid>
-        <w:gridCol w:w="8959"/>
-      </w:tblGrid>
       <w:tr>
+        <w:tblPrEx>
+          <w:tblBorders>
+            <w:bottom w:val="single" w:sz="4" w:space="0" w:color="auto"/>
+          </w:tblBorders>
+        </w:tblPrEx>
         <w:tc>
           <w:tcPr>
             <w:tcW w:w="8959" w:type="dxa"/>
+            <w:gridSpan w:val="2"/>
           </w:tcPr>
           <w:p>
             <w:pPr>
@@ -772,7 +740,7 @@
               <w:pStyle w:val="Topic300"/>
               <w:rPr>
                 <w:rFonts w:eastAsia="Arial" w:cs="Arial"/>
-                <w:color w:val="FF0000"/>
+                <w:color w:val="000000" w:themeColor="text1"/>
                 <w:szCs w:val="20"/>
               </w:rPr>
             </w:pPr>
@@ -820,6 +788,7 @@
             <w:r>
               <w:rPr>
                 <w:rFonts w:eastAsia="Arial" w:cs="Arial"/>
+                <w:color w:val="000000" w:themeColor="text1"/>
                 <w:szCs w:val="20"/>
               </w:rPr>
               <w:t>{{ KOORDINATEN</w:t>
@@ -828,6 +797,7 @@
             <w:r>
               <w:rPr>
                 <w:rFonts w:eastAsia="Arial" w:cs="Arial"/>
+                <w:color w:val="000000" w:themeColor="text1"/>
                 <w:szCs w:val="20"/>
               </w:rPr>
               <w:t xml:space="preserve"> }}</w:t>
@@ -836,10 +806,7 @@
           <w:p>
             <w:pPr>
               <w:pStyle w:val="Topic300"/>
-              <w:spacing w:after="40"/>
-              <w:rPr>
-                <w:rFonts w:eastAsia="Arial" w:cs="Arial"/>
-                <w:color w:val="FF0000"/>
+              <w:rPr>
                 <w:szCs w:val="20"/>
               </w:rPr>
             </w:pPr>
@@ -860,7 +827,6 @@
             <w:proofErr w:type="gramStart"/>
             <w:r>
               <w:rPr>
-                <w:rFonts w:eastAsia="Arial" w:cs="Arial"/>
                 <w:szCs w:val="20"/>
               </w:rPr>
               <w:t>{{ NUTZUNGSZONE</w:t>
@@ -868,7 +834,6 @@
             <w:proofErr w:type="gramEnd"/>
             <w:r>
               <w:rPr>
-                <w:rFonts w:eastAsia="Arial" w:cs="Arial"/>
                 <w:szCs w:val="20"/>
               </w:rPr>
               <w:t xml:space="preserve"> }}</w:t>
@@ -878,7 +843,7 @@
             <w:pPr>
               <w:pStyle w:val="Topic300"/>
               <w:rPr>
-                <w:b/>
+                <w:szCs w:val="20"/>
               </w:rPr>
             </w:pPr>
           </w:p>
@@ -887,11 +852,6 @@
     </w:tbl>
     <w:p>
       <w:pPr>
-        <w:pStyle w:val="Blocktext"/>
-      </w:pPr>
-    </w:p>
-    <w:p>
-      <w:pPr>
         <w:pStyle w:val="berschrift1"/>
       </w:pPr>
       <w:r>
@@ -902,8 +862,6 @@
       <w:pPr>
         <w:pStyle w:val="Blocktext"/>
       </w:pPr>
-      <w:bookmarkStart w:id="0" w:name="TEXTBEGINN"/>
-      <w:bookmarkEnd w:id="0"/>
     </w:p>
     <w:p>
       <w:pPr>
@@ -939,17 +897,11 @@
     <w:p>
       <w:pPr>
         <w:pStyle w:val="Blocktext"/>
-        <w:rPr>
-          <w:bCs/>
-        </w:rPr>
       </w:pPr>
     </w:p>
     <w:p>
       <w:pPr>
         <w:pStyle w:val="Blocktext"/>
-        <w:rPr>
-          <w:bCs/>
-        </w:rPr>
       </w:pPr>
     </w:p>
     <w:p>
@@ -963,17 +915,11 @@
     <w:p>
       <w:pPr>
         <w:pStyle w:val="Blocktext"/>
-        <w:rPr>
-          <w:bCs/>
-        </w:rPr>
       </w:pPr>
     </w:p>
     <w:p>
       <w:pPr>
         <w:pStyle w:val="Blocktext"/>
-        <w:rPr>
-          <w:bCs/>
-        </w:rPr>
       </w:pPr>
     </w:p>
     <w:tbl>
@@ -1020,12 +966,11 @@
             <w:pPr>
               <w:pStyle w:val="Unterschrift"/>
             </w:pPr>
+            <w:bookmarkStart w:id="0" w:name="Unterschrift"/>
+            <w:bookmarkEnd w:id="0"/>
             <w:proofErr w:type="gramStart"/>
             <w:r>
-              <w:t xml:space="preserve">{{ </w:t>
-            </w:r>
-            <w:r>
-              <w:t>ANGEMELDET</w:t>
+              <w:t>{{ ANGEMELDET</w:t>
             </w:r>
             <w:proofErr w:type="gramEnd"/>
             <w:r>
@@ -1042,21 +987,18 @@
           </w:p>
           <w:p>
             <w:pPr>
-              <w:pStyle w:val="Unterschrift"/>
+              <w:pStyle w:val="UnterschriftFunktion"/>
+              <w:rPr>
+                <w:color w:val="FF0000"/>
+              </w:rPr>
             </w:pPr>
             <w:proofErr w:type="gramStart"/>
             <w:r>
-              <w:t xml:space="preserve">{{ </w:t>
-            </w:r>
-            <w:r>
-              <w:t>ANGEMELDET</w:t>
+              <w:t>{{ ANGEMELDET</w:t>
             </w:r>
             <w:proofErr w:type="gramEnd"/>
             <w:r>
               <w:t>_POSITION }}</w:t>
-            </w:r>
-            <w:r>
-              <w:br/>
             </w:r>
           </w:p>
         </w:tc>
@@ -1067,6 +1009,9 @@
           <w:p>
             <w:pPr>
               <w:pStyle w:val="Unterschrift"/>
+              <w:rPr>
+                <w:color w:val="FF0000"/>
+              </w:rPr>
             </w:pPr>
           </w:p>
         </w:tc>
@@ -1074,16 +1019,20 @@
     </w:tbl>
     <w:p>
       <w:pPr>
-        <w:pStyle w:val="BeilagenersteZeile"/>
+        <w:pStyle w:val="AuflistungmitSymbolenmitAbstand"/>
+        <w:numPr>
+          <w:ilvl w:val="0"/>
+          <w:numId w:val="0"/>
+        </w:numPr>
       </w:pPr>
     </w:p>
     <w:sectPr>
-      <w:headerReference w:type="default" r:id="rId12"/>
-      <w:footerReference w:type="default" r:id="rId13"/>
-      <w:type w:val="continuous"/>
+      <w:footerReference w:type="default" r:id="rId11"/>
+      <w:headerReference w:type="first" r:id="rId12"/>
       <w:pgSz w:w="11906" w:h="16838" w:code="9"/>
       <w:pgMar w:top="1899" w:right="1134" w:bottom="1134" w:left="1814" w:header="567" w:footer="476" w:gutter="0"/>
       <w:cols w:space="708"/>
+      <w:titlePg/>
       <w:docGrid w:linePitch="360"/>
     </w:sectPr>
   </w:body>
@@ -1143,41 +1092,19 @@
       </w:rPr>
       <w:t xml:space="preserve"> von </w:t>
     </w:r>
-    <w:r>
-      <w:rPr>
-        <w:noProof/>
-        <w:lang w:val="de-DE"/>
-      </w:rPr>
-      <w:fldChar w:fldCharType="begin"/>
-    </w:r>
-    <w:r>
-      <w:rPr>
-        <w:noProof/>
-        <w:lang w:val="de-DE"/>
-      </w:rPr>
-      <w:instrText>NUMPAGES  \* Arabic  \* MERGEFORMAT</w:instrText>
-    </w:r>
-    <w:r>
-      <w:rPr>
-        <w:noProof/>
-        <w:lang w:val="de-DE"/>
-      </w:rPr>
-      <w:fldChar w:fldCharType="separate"/>
-    </w:r>
-    <w:r>
-      <w:rPr>
-        <w:noProof/>
-        <w:lang w:val="de-DE"/>
-      </w:rPr>
-      <w:t>2</w:t>
-    </w:r>
-    <w:r>
-      <w:rPr>
-        <w:noProof/>
-        <w:lang w:val="de-DE"/>
-      </w:rPr>
-      <w:fldChar w:fldCharType="end"/>
-    </w:r>
+    <w:fldSimple w:instr="SECTIONPAGES  \* Arabic  \* MERGEFORMAT">
+      <w:r>
+        <w:rPr>
+          <w:noProof/>
+        </w:rPr>
+        <w:t>2</w:t>
+      </w:r>
+    </w:fldSimple>
+  </w:p>
+  <w:p>
+    <w:pPr>
+      <w:pStyle w:val="Fuzeile"/>
+    </w:pPr>
   </w:p>
 </w:ftr>
 </file>
@@ -1208,27 +1135,24 @@
   <w:p>
     <w:pPr>
       <w:pStyle w:val="Kopfzeile"/>
-      <w:tabs>
-        <w:tab w:val="left" w:pos="-2694"/>
-      </w:tabs>
     </w:pPr>
     <w:r>
       <w:rPr>
         <w:noProof/>
       </w:rPr>
       <w:drawing>
-        <wp:anchor distT="0" distB="0" distL="114300" distR="114300" simplePos="0" relativeHeight="251659264" behindDoc="1" locked="0" layoutInCell="1" allowOverlap="1" wp14:anchorId="6836E11E" wp14:editId="6836E11F">
+        <wp:anchor distT="0" distB="0" distL="114300" distR="114300" simplePos="0" relativeHeight="251658240" behindDoc="1" locked="0" layoutInCell="1" allowOverlap="1" wp14:anchorId="28947CA9" wp14:editId="3B499CC4">
           <wp:simplePos x="0" y="0"/>
           <wp:positionH relativeFrom="margin">
-            <wp:posOffset>0</wp:posOffset>
+            <wp:posOffset>14377</wp:posOffset>
           </wp:positionH>
           <wp:positionV relativeFrom="paragraph">
-            <wp:posOffset>0</wp:posOffset>
+            <wp:posOffset>48883</wp:posOffset>
           </wp:positionV>
           <wp:extent cx="900000" cy="453600"/>
           <wp:effectExtent l="0" t="0" r="0" b="3810"/>
           <wp:wrapNone/>
-          <wp:docPr id="1" name="Grafik 1"/>
+          <wp:docPr id="3" name="Grafik 3"/>
           <wp:cNvGraphicFramePr>
             <a:graphicFrameLocks xmlns:a="http://schemas.openxmlformats.org/drawingml/2006/main" noChangeAspect="1"/>
           </wp:cNvGraphicFramePr>
@@ -1276,22 +1200,12 @@
 </w:hdr>
 </file>
 
-<file path=word/header2.xml><?xml version="1.0" encoding="utf-8"?>
-<w:hdr xmlns:wpc="http://schemas.microsoft.com/office/word/2010/wordprocessingCanvas" xmlns:cx="http://schemas.microsoft.com/office/drawing/2014/chartex" xmlns:cx1="http://schemas.microsoft.com/office/drawing/2015/9/8/chartex" xmlns:cx2="http://schemas.microsoft.com/office/drawing/2015/10/21/chartex" xmlns:cx3="http://schemas.microsoft.com/office/drawing/2016/5/9/chartex" xmlns:cx4="http://schemas.microsoft.com/office/drawing/2016/5/10/chartex" xmlns:cx5="http://schemas.microsoft.com/office/drawing/2016/5/11/chartex" xmlns:cx6="http://schemas.microsoft.com/office/drawing/2016/5/12/chartex" xmlns:cx7="http://schemas.microsoft.com/office/drawing/2016/5/13/chartex" xmlns:cx8="http://schemas.microsoft.com/office/drawing/2016/5/14/chartex" xmlns:mc="http://schemas.openxmlformats.org/markup-compatibility/2006" xmlns:aink="http://schemas.microsoft.com/office/drawing/2016/ink" xmlns:am3d="http://schemas.microsoft.com/office/drawing/2017/model3d" xmlns:o="urn:schemas-microsoft-com:office:office" xmlns:oel="http://schemas.microsoft.com/office/2019/extlst" xmlns:r="http://schemas.openxmlformats.org/officeDocument/2006/relationships" xmlns:m="http://schemas.openxmlformats.org/officeDocument/2006/math" xmlns:v="urn:schemas-microsoft-com:vml" xmlns:wp14="http://schemas.microsoft.com/office/word/2010/wordprocessingDrawing" xmlns:wp="http://schemas.openxmlformats.org/drawingml/2006/wordprocessingDrawing" xmlns:w10="urn:schemas-microsoft-com:office:word" xmlns:w="http://schemas.openxmlformats.org/wordprocessingml/2006/main" xmlns:w14="http://schemas.microsoft.com/office/word/2010/wordml" xmlns:w15="http://schemas.microsoft.com/office/word/2012/wordml" xmlns:w16cex="http://schemas.microsoft.com/office/word/2018/wordml/cex" xmlns:w16cid="http://schemas.microsoft.com/office/word/2016/wordml/cid" xmlns:w16="http://schemas.microsoft.com/office/word/2018/wordml" xmlns:w16du="http://schemas.microsoft.com/office/word/2023/wordml/word16du" xmlns:w16sdtdh="http://schemas.microsoft.com/office/word/2020/wordml/sdtdatahash" xmlns:w16sdtfl="http://schemas.microsoft.com/office/word/2024/wordml/sdtformatlock" xmlns:w16se="http://schemas.microsoft.com/office/word/2015/wordml/symex" xmlns:wpg="http://schemas.microsoft.com/office/word/2010/wordprocessingGroup" xmlns:wpi="http://schemas.microsoft.com/office/word/2010/wordprocessingInk" xmlns:wne="http://schemas.microsoft.com/office/word/2006/wordml" xmlns:wps="http://schemas.microsoft.com/office/word/2010/wordprocessingShape" mc:Ignorable="w14 w15 w16se w16cid w16 w16cex w16sdtdh w16sdtfl w16du wp14">
-  <w:p>
-    <w:pPr>
-      <w:pStyle w:val="Kopfzeile"/>
-    </w:pPr>
-  </w:p>
-</w:hdr>
-</file>
-
 <file path=word/numbering.xml><?xml version="1.0" encoding="utf-8"?>
 <w:numbering xmlns:wpc="http://schemas.microsoft.com/office/word/2010/wordprocessingCanvas" xmlns:cx="http://schemas.microsoft.com/office/drawing/2014/chartex" xmlns:cx1="http://schemas.microsoft.com/office/drawing/2015/9/8/chartex" xmlns:cx2="http://schemas.microsoft.com/office/drawing/2015/10/21/chartex" xmlns:cx3="http://schemas.microsoft.com/office/drawing/2016/5/9/chartex" xmlns:cx4="http://schemas.microsoft.com/office/drawing/2016/5/10/chartex" xmlns:cx5="http://schemas.microsoft.com/office/drawing/2016/5/11/chartex" xmlns:cx6="http://schemas.microsoft.com/office/drawing/2016/5/12/chartex" xmlns:cx7="http://schemas.microsoft.com/office/drawing/2016/5/13/chartex" xmlns:cx8="http://schemas.microsoft.com/office/drawing/2016/5/14/chartex" xmlns:mc="http://schemas.openxmlformats.org/markup-compatibility/2006" xmlns:aink="http://schemas.microsoft.com/office/drawing/2016/ink" xmlns:am3d="http://schemas.microsoft.com/office/drawing/2017/model3d" xmlns:o="urn:schemas-microsoft-com:office:office" xmlns:oel="http://schemas.microsoft.com/office/2019/extlst" xmlns:r="http://schemas.openxmlformats.org/officeDocument/2006/relationships" xmlns:m="http://schemas.openxmlformats.org/officeDocument/2006/math" xmlns:v="urn:schemas-microsoft-com:vml" xmlns:wp14="http://schemas.microsoft.com/office/word/2010/wordprocessingDrawing" xmlns:wp="http://schemas.openxmlformats.org/drawingml/2006/wordprocessingDrawing" xmlns:w10="urn:schemas-microsoft-com:office:word" xmlns:w="http://schemas.openxmlformats.org/wordprocessingml/2006/main" xmlns:w14="http://schemas.microsoft.com/office/word/2010/wordml" xmlns:w15="http://schemas.microsoft.com/office/word/2012/wordml" xmlns:w16cex="http://schemas.microsoft.com/office/word/2018/wordml/cex" xmlns:w16cid="http://schemas.microsoft.com/office/word/2016/wordml/cid" xmlns:w16="http://schemas.microsoft.com/office/word/2018/wordml" xmlns:w16du="http://schemas.microsoft.com/office/word/2023/wordml/word16du" xmlns:w16sdtdh="http://schemas.microsoft.com/office/word/2020/wordml/sdtdatahash" xmlns:w16sdtfl="http://schemas.microsoft.com/office/word/2024/wordml/sdtformatlock" xmlns:w16se="http://schemas.microsoft.com/office/word/2015/wordml/symex" xmlns:wpg="http://schemas.microsoft.com/office/word/2010/wordprocessingGroup" xmlns:wpi="http://schemas.microsoft.com/office/word/2010/wordprocessingInk" xmlns:wne="http://schemas.microsoft.com/office/word/2006/wordml" xmlns:wps="http://schemas.microsoft.com/office/word/2010/wordprocessingShape" mc:Ignorable="w14 w15 w16se w16cid w16 w16cex w16sdtdh w16sdtfl w16du wp14">
   <w:abstractNum w:abstractNumId="0" w15:restartNumberingAfterBreak="0">
     <w:nsid w:val="FFFFFF7C"/>
     <w:multiLevelType w:val="singleLevel"/>
-    <w:tmpl w:val="BD7CDEC8"/>
+    <w:tmpl w:val="92F670BE"/>
     <w:lvl w:ilvl="0">
       <w:start w:val="1"/>
       <w:numFmt w:val="decimal"/>
@@ -1308,7 +1222,7 @@
   <w:abstractNum w:abstractNumId="1" w15:restartNumberingAfterBreak="0">
     <w:nsid w:val="FFFFFF7D"/>
     <w:multiLevelType w:val="singleLevel"/>
-    <w:tmpl w:val="A434CC88"/>
+    <w:tmpl w:val="16B2E930"/>
     <w:lvl w:ilvl="0">
       <w:start w:val="1"/>
       <w:numFmt w:val="decimal"/>
@@ -1325,7 +1239,7 @@
   <w:abstractNum w:abstractNumId="2" w15:restartNumberingAfterBreak="0">
     <w:nsid w:val="FFFFFF7E"/>
     <w:multiLevelType w:val="singleLevel"/>
-    <w:tmpl w:val="83361E3E"/>
+    <w:tmpl w:val="D332AFF0"/>
     <w:lvl w:ilvl="0">
       <w:start w:val="1"/>
       <w:numFmt w:val="decimal"/>
@@ -1342,7 +1256,7 @@
   <w:abstractNum w:abstractNumId="3" w15:restartNumberingAfterBreak="0">
     <w:nsid w:val="FFFFFF7F"/>
     <w:multiLevelType w:val="singleLevel"/>
-    <w:tmpl w:val="3A9A8390"/>
+    <w:tmpl w:val="EFD42D8A"/>
     <w:lvl w:ilvl="0">
       <w:start w:val="1"/>
       <w:numFmt w:val="decimal"/>
@@ -1359,7 +1273,7 @@
   <w:abstractNum w:abstractNumId="4" w15:restartNumberingAfterBreak="0">
     <w:nsid w:val="FFFFFF80"/>
     <w:multiLevelType w:val="singleLevel"/>
-    <w:tmpl w:val="3C9824F0"/>
+    <w:tmpl w:val="864C8580"/>
     <w:lvl w:ilvl="0">
       <w:start w:val="1"/>
       <w:numFmt w:val="bullet"/>
@@ -1379,7 +1293,7 @@
   <w:abstractNum w:abstractNumId="5" w15:restartNumberingAfterBreak="0">
     <w:nsid w:val="FFFFFF81"/>
     <w:multiLevelType w:val="singleLevel"/>
-    <w:tmpl w:val="23AE3C5E"/>
+    <w:tmpl w:val="8F52C4C6"/>
     <w:lvl w:ilvl="0">
       <w:start w:val="1"/>
       <w:numFmt w:val="bullet"/>
@@ -1399,7 +1313,7 @@
   <w:abstractNum w:abstractNumId="6" w15:restartNumberingAfterBreak="0">
     <w:nsid w:val="FFFFFF82"/>
     <w:multiLevelType w:val="singleLevel"/>
-    <w:tmpl w:val="2598988E"/>
+    <w:tmpl w:val="41BEABD6"/>
     <w:lvl w:ilvl="0">
       <w:start w:val="1"/>
       <w:numFmt w:val="bullet"/>
@@ -1419,7 +1333,7 @@
   <w:abstractNum w:abstractNumId="7" w15:restartNumberingAfterBreak="0">
     <w:nsid w:val="FFFFFF83"/>
     <w:multiLevelType w:val="singleLevel"/>
-    <w:tmpl w:val="E0022CE4"/>
+    <w:tmpl w:val="15E432B4"/>
     <w:lvl w:ilvl="0">
       <w:start w:val="1"/>
       <w:numFmt w:val="bullet"/>
@@ -1439,7 +1353,7 @@
   <w:abstractNum w:abstractNumId="8" w15:restartNumberingAfterBreak="0">
     <w:nsid w:val="FFFFFF88"/>
     <w:multiLevelType w:val="singleLevel"/>
-    <w:tmpl w:val="B0E8365A"/>
+    <w:tmpl w:val="001A441A"/>
     <w:lvl w:ilvl="0">
       <w:start w:val="1"/>
       <w:numFmt w:val="decimal"/>
@@ -1456,7 +1370,7 @@
   <w:abstractNum w:abstractNumId="9" w15:restartNumberingAfterBreak="0">
     <w:nsid w:val="FFFFFF89"/>
     <w:multiLevelType w:val="singleLevel"/>
-    <w:tmpl w:val="D72EB824"/>
+    <w:tmpl w:val="2A7670FA"/>
     <w:lvl w:ilvl="0">
       <w:start w:val="1"/>
       <w:numFmt w:val="bullet"/>
@@ -1751,6 +1665,364 @@
     </w:lvl>
   </w:abstractNum>
   <w:abstractNum w:abstractNumId="12" w15:restartNumberingAfterBreak="0">
+    <w:nsid w:val="04F9618D"/>
+    <w:multiLevelType w:val="singleLevel"/>
+    <w:tmpl w:val="280E0612"/>
+    <w:lvl w:ilvl="0">
+      <w:start w:val="1"/>
+      <w:numFmt w:val="decimal"/>
+      <w:pStyle w:val="Nummerierung"/>
+      <w:lvlText w:val="%1."/>
+      <w:lvlJc w:val="left"/>
+      <w:pPr>
+        <w:tabs>
+          <w:tab w:val="num" w:pos="360"/>
+        </w:tabs>
+        <w:ind w:left="360" w:hanging="360"/>
+      </w:pPr>
+    </w:lvl>
+  </w:abstractNum>
+  <w:abstractNum w:abstractNumId="13" w15:restartNumberingAfterBreak="0">
+    <w:nsid w:val="06C55743"/>
+    <w:multiLevelType w:val="hybridMultilevel"/>
+    <w:tmpl w:val="F48AD716"/>
+    <w:lvl w:ilvl="0" w:tplc="A6D6016C">
+      <w:start w:val="1"/>
+      <w:numFmt w:val="decimal"/>
+      <w:pStyle w:val="Nummerierung9"/>
+      <w:lvlText w:val="%1."/>
+      <w:lvlJc w:val="left"/>
+      <w:pPr>
+        <w:tabs>
+          <w:tab w:val="num" w:pos="360"/>
+        </w:tabs>
+        <w:ind w:left="360" w:hanging="360"/>
+      </w:pPr>
+    </w:lvl>
+    <w:lvl w:ilvl="1" w:tplc="08070019" w:tentative="1">
+      <w:start w:val="1"/>
+      <w:numFmt w:val="lowerLetter"/>
+      <w:lvlText w:val="%2."/>
+      <w:lvlJc w:val="left"/>
+      <w:pPr>
+        <w:tabs>
+          <w:tab w:val="num" w:pos="1440"/>
+        </w:tabs>
+        <w:ind w:left="1440" w:hanging="360"/>
+      </w:pPr>
+    </w:lvl>
+    <w:lvl w:ilvl="2" w:tplc="0807001B" w:tentative="1">
+      <w:start w:val="1"/>
+      <w:numFmt w:val="lowerRoman"/>
+      <w:lvlText w:val="%3."/>
+      <w:lvlJc w:val="right"/>
+      <w:pPr>
+        <w:tabs>
+          <w:tab w:val="num" w:pos="2160"/>
+        </w:tabs>
+        <w:ind w:left="2160" w:hanging="180"/>
+      </w:pPr>
+    </w:lvl>
+    <w:lvl w:ilvl="3" w:tplc="0807000F" w:tentative="1">
+      <w:start w:val="1"/>
+      <w:numFmt w:val="decimal"/>
+      <w:lvlText w:val="%4."/>
+      <w:lvlJc w:val="left"/>
+      <w:pPr>
+        <w:tabs>
+          <w:tab w:val="num" w:pos="2880"/>
+        </w:tabs>
+        <w:ind w:left="2880" w:hanging="360"/>
+      </w:pPr>
+    </w:lvl>
+    <w:lvl w:ilvl="4" w:tplc="08070019" w:tentative="1">
+      <w:start w:val="1"/>
+      <w:numFmt w:val="lowerLetter"/>
+      <w:lvlText w:val="%5."/>
+      <w:lvlJc w:val="left"/>
+      <w:pPr>
+        <w:tabs>
+          <w:tab w:val="num" w:pos="3600"/>
+        </w:tabs>
+        <w:ind w:left="3600" w:hanging="360"/>
+      </w:pPr>
+    </w:lvl>
+    <w:lvl w:ilvl="5" w:tplc="0807001B" w:tentative="1">
+      <w:start w:val="1"/>
+      <w:numFmt w:val="lowerRoman"/>
+      <w:lvlText w:val="%6."/>
+      <w:lvlJc w:val="right"/>
+      <w:pPr>
+        <w:tabs>
+          <w:tab w:val="num" w:pos="4320"/>
+        </w:tabs>
+        <w:ind w:left="4320" w:hanging="180"/>
+      </w:pPr>
+    </w:lvl>
+    <w:lvl w:ilvl="6" w:tplc="0807000F" w:tentative="1">
+      <w:start w:val="1"/>
+      <w:numFmt w:val="decimal"/>
+      <w:lvlText w:val="%7."/>
+      <w:lvlJc w:val="left"/>
+      <w:pPr>
+        <w:tabs>
+          <w:tab w:val="num" w:pos="5040"/>
+        </w:tabs>
+        <w:ind w:left="5040" w:hanging="360"/>
+      </w:pPr>
+    </w:lvl>
+    <w:lvl w:ilvl="7" w:tplc="08070019" w:tentative="1">
+      <w:start w:val="1"/>
+      <w:numFmt w:val="lowerLetter"/>
+      <w:lvlText w:val="%8."/>
+      <w:lvlJc w:val="left"/>
+      <w:pPr>
+        <w:tabs>
+          <w:tab w:val="num" w:pos="5760"/>
+        </w:tabs>
+        <w:ind w:left="5760" w:hanging="360"/>
+      </w:pPr>
+    </w:lvl>
+    <w:lvl w:ilvl="8" w:tplc="0807001B" w:tentative="1">
+      <w:start w:val="1"/>
+      <w:numFmt w:val="lowerRoman"/>
+      <w:lvlText w:val="%9."/>
+      <w:lvlJc w:val="right"/>
+      <w:pPr>
+        <w:tabs>
+          <w:tab w:val="num" w:pos="6480"/>
+        </w:tabs>
+        <w:ind w:left="6480" w:hanging="180"/>
+      </w:pPr>
+    </w:lvl>
+  </w:abstractNum>
+  <w:abstractNum w:abstractNumId="14" w15:restartNumberingAfterBreak="0">
+    <w:nsid w:val="0C152EE2"/>
+    <w:multiLevelType w:val="hybridMultilevel"/>
+    <w:tmpl w:val="8D187E80"/>
+    <w:lvl w:ilvl="0" w:tplc="08070001">
+      <w:start w:val="1"/>
+      <w:numFmt w:val="bullet"/>
+      <w:lvlText w:val=""/>
+      <w:lvlJc w:val="left"/>
+      <w:pPr>
+        <w:ind w:left="805" w:hanging="360"/>
+      </w:pPr>
+      <w:rPr>
+        <w:rFonts w:ascii="Symbol" w:hAnsi="Symbol" w:hint="default"/>
+      </w:rPr>
+    </w:lvl>
+    <w:lvl w:ilvl="1" w:tplc="08070003" w:tentative="1">
+      <w:start w:val="1"/>
+      <w:numFmt w:val="bullet"/>
+      <w:lvlText w:val="o"/>
+      <w:lvlJc w:val="left"/>
+      <w:pPr>
+        <w:ind w:left="1525" w:hanging="360"/>
+      </w:pPr>
+      <w:rPr>
+        <w:rFonts w:ascii="Courier New" w:hAnsi="Courier New" w:cs="Courier New" w:hint="default"/>
+      </w:rPr>
+    </w:lvl>
+    <w:lvl w:ilvl="2" w:tplc="08070005" w:tentative="1">
+      <w:start w:val="1"/>
+      <w:numFmt w:val="bullet"/>
+      <w:lvlText w:val=""/>
+      <w:lvlJc w:val="left"/>
+      <w:pPr>
+        <w:ind w:left="2245" w:hanging="360"/>
+      </w:pPr>
+      <w:rPr>
+        <w:rFonts w:ascii="Wingdings" w:hAnsi="Wingdings" w:hint="default"/>
+      </w:rPr>
+    </w:lvl>
+    <w:lvl w:ilvl="3" w:tplc="08070001" w:tentative="1">
+      <w:start w:val="1"/>
+      <w:numFmt w:val="bullet"/>
+      <w:lvlText w:val=""/>
+      <w:lvlJc w:val="left"/>
+      <w:pPr>
+        <w:ind w:left="2965" w:hanging="360"/>
+      </w:pPr>
+      <w:rPr>
+        <w:rFonts w:ascii="Symbol" w:hAnsi="Symbol" w:hint="default"/>
+      </w:rPr>
+    </w:lvl>
+    <w:lvl w:ilvl="4" w:tplc="08070003" w:tentative="1">
+      <w:start w:val="1"/>
+      <w:numFmt w:val="bullet"/>
+      <w:lvlText w:val="o"/>
+      <w:lvlJc w:val="left"/>
+      <w:pPr>
+        <w:ind w:left="3685" w:hanging="360"/>
+      </w:pPr>
+      <w:rPr>
+        <w:rFonts w:ascii="Courier New" w:hAnsi="Courier New" w:cs="Courier New" w:hint="default"/>
+      </w:rPr>
+    </w:lvl>
+    <w:lvl w:ilvl="5" w:tplc="08070005" w:tentative="1">
+      <w:start w:val="1"/>
+      <w:numFmt w:val="bullet"/>
+      <w:lvlText w:val=""/>
+      <w:lvlJc w:val="left"/>
+      <w:pPr>
+        <w:ind w:left="4405" w:hanging="360"/>
+      </w:pPr>
+      <w:rPr>
+        <w:rFonts w:ascii="Wingdings" w:hAnsi="Wingdings" w:hint="default"/>
+      </w:rPr>
+    </w:lvl>
+    <w:lvl w:ilvl="6" w:tplc="08070001" w:tentative="1">
+      <w:start w:val="1"/>
+      <w:numFmt w:val="bullet"/>
+      <w:lvlText w:val=""/>
+      <w:lvlJc w:val="left"/>
+      <w:pPr>
+        <w:ind w:left="5125" w:hanging="360"/>
+      </w:pPr>
+      <w:rPr>
+        <w:rFonts w:ascii="Symbol" w:hAnsi="Symbol" w:hint="default"/>
+      </w:rPr>
+    </w:lvl>
+    <w:lvl w:ilvl="7" w:tplc="08070003" w:tentative="1">
+      <w:start w:val="1"/>
+      <w:numFmt w:val="bullet"/>
+      <w:lvlText w:val="o"/>
+      <w:lvlJc w:val="left"/>
+      <w:pPr>
+        <w:ind w:left="5845" w:hanging="360"/>
+      </w:pPr>
+      <w:rPr>
+        <w:rFonts w:ascii="Courier New" w:hAnsi="Courier New" w:cs="Courier New" w:hint="default"/>
+      </w:rPr>
+    </w:lvl>
+    <w:lvl w:ilvl="8" w:tplc="08070005" w:tentative="1">
+      <w:start w:val="1"/>
+      <w:numFmt w:val="bullet"/>
+      <w:lvlText w:val=""/>
+      <w:lvlJc w:val="left"/>
+      <w:pPr>
+        <w:ind w:left="6565" w:hanging="360"/>
+      </w:pPr>
+      <w:rPr>
+        <w:rFonts w:ascii="Wingdings" w:hAnsi="Wingdings" w:hint="default"/>
+      </w:rPr>
+    </w:lvl>
+  </w:abstractNum>
+  <w:abstractNum w:abstractNumId="15" w15:restartNumberingAfterBreak="0">
+    <w:nsid w:val="1E7D5082"/>
+    <w:multiLevelType w:val="hybridMultilevel"/>
+    <w:tmpl w:val="BDA85012"/>
+    <w:lvl w:ilvl="0" w:tplc="08070001">
+      <w:start w:val="1"/>
+      <w:numFmt w:val="bullet"/>
+      <w:lvlText w:val=""/>
+      <w:lvlJc w:val="left"/>
+      <w:pPr>
+        <w:ind w:left="720" w:hanging="360"/>
+      </w:pPr>
+      <w:rPr>
+        <w:rFonts w:ascii="Symbol" w:hAnsi="Symbol" w:hint="default"/>
+      </w:rPr>
+    </w:lvl>
+    <w:lvl w:ilvl="1" w:tplc="08070003" w:tentative="1">
+      <w:start w:val="1"/>
+      <w:numFmt w:val="bullet"/>
+      <w:lvlText w:val="o"/>
+      <w:lvlJc w:val="left"/>
+      <w:pPr>
+        <w:ind w:left="1440" w:hanging="360"/>
+      </w:pPr>
+      <w:rPr>
+        <w:rFonts w:ascii="Courier New" w:hAnsi="Courier New" w:cs="Courier New" w:hint="default"/>
+      </w:rPr>
+    </w:lvl>
+    <w:lvl w:ilvl="2" w:tplc="08070005" w:tentative="1">
+      <w:start w:val="1"/>
+      <w:numFmt w:val="bullet"/>
+      <w:lvlText w:val=""/>
+      <w:lvlJc w:val="left"/>
+      <w:pPr>
+        <w:ind w:left="2160" w:hanging="360"/>
+      </w:pPr>
+      <w:rPr>
+        <w:rFonts w:ascii="Wingdings" w:hAnsi="Wingdings" w:hint="default"/>
+      </w:rPr>
+    </w:lvl>
+    <w:lvl w:ilvl="3" w:tplc="08070001" w:tentative="1">
+      <w:start w:val="1"/>
+      <w:numFmt w:val="bullet"/>
+      <w:lvlText w:val=""/>
+      <w:lvlJc w:val="left"/>
+      <w:pPr>
+        <w:ind w:left="2880" w:hanging="360"/>
+      </w:pPr>
+      <w:rPr>
+        <w:rFonts w:ascii="Symbol" w:hAnsi="Symbol" w:hint="default"/>
+      </w:rPr>
+    </w:lvl>
+    <w:lvl w:ilvl="4" w:tplc="08070003" w:tentative="1">
+      <w:start w:val="1"/>
+      <w:numFmt w:val="bullet"/>
+      <w:lvlText w:val="o"/>
+      <w:lvlJc w:val="left"/>
+      <w:pPr>
+        <w:ind w:left="3600" w:hanging="360"/>
+      </w:pPr>
+      <w:rPr>
+        <w:rFonts w:ascii="Courier New" w:hAnsi="Courier New" w:cs="Courier New" w:hint="default"/>
+      </w:rPr>
+    </w:lvl>
+    <w:lvl w:ilvl="5" w:tplc="08070005" w:tentative="1">
+      <w:start w:val="1"/>
+      <w:numFmt w:val="bullet"/>
+      <w:lvlText w:val=""/>
+      <w:lvlJc w:val="left"/>
+      <w:pPr>
+        <w:ind w:left="4320" w:hanging="360"/>
+      </w:pPr>
+      <w:rPr>
+        <w:rFonts w:ascii="Wingdings" w:hAnsi="Wingdings" w:hint="default"/>
+      </w:rPr>
+    </w:lvl>
+    <w:lvl w:ilvl="6" w:tplc="08070001" w:tentative="1">
+      <w:start w:val="1"/>
+      <w:numFmt w:val="bullet"/>
+      <w:lvlText w:val=""/>
+      <w:lvlJc w:val="left"/>
+      <w:pPr>
+        <w:ind w:left="5040" w:hanging="360"/>
+      </w:pPr>
+      <w:rPr>
+        <w:rFonts w:ascii="Symbol" w:hAnsi="Symbol" w:hint="default"/>
+      </w:rPr>
+    </w:lvl>
+    <w:lvl w:ilvl="7" w:tplc="08070003" w:tentative="1">
+      <w:start w:val="1"/>
+      <w:numFmt w:val="bullet"/>
+      <w:lvlText w:val="o"/>
+      <w:lvlJc w:val="left"/>
+      <w:pPr>
+        <w:ind w:left="5760" w:hanging="360"/>
+      </w:pPr>
+      <w:rPr>
+        <w:rFonts w:ascii="Courier New" w:hAnsi="Courier New" w:cs="Courier New" w:hint="default"/>
+      </w:rPr>
+    </w:lvl>
+    <w:lvl w:ilvl="8" w:tplc="08070005" w:tentative="1">
+      <w:start w:val="1"/>
+      <w:numFmt w:val="bullet"/>
+      <w:lvlText w:val=""/>
+      <w:lvlJc w:val="left"/>
+      <w:pPr>
+        <w:ind w:left="6480" w:hanging="360"/>
+      </w:pPr>
+      <w:rPr>
+        <w:rFonts w:ascii="Wingdings" w:hAnsi="Wingdings" w:hint="default"/>
+      </w:rPr>
+    </w:lvl>
+  </w:abstractNum>
+  <w:abstractNum w:abstractNumId="16" w15:restartNumberingAfterBreak="0">
     <w:nsid w:val="23344003"/>
     <w:multiLevelType w:val="multilevel"/>
     <w:tmpl w:val="FD3A66B2"/>
@@ -1864,7 +2136,7 @@
       </w:rPr>
     </w:lvl>
   </w:abstractNum>
-  <w:abstractNum w:abstractNumId="13" w15:restartNumberingAfterBreak="0">
+  <w:abstractNum w:abstractNumId="17" w15:restartNumberingAfterBreak="0">
     <w:nsid w:val="25D7700A"/>
     <w:multiLevelType w:val="multilevel"/>
     <w:tmpl w:val="6B0072C8"/>
@@ -2005,7 +2277,7 @@
       </w:rPr>
     </w:lvl>
   </w:abstractNum>
-  <w:abstractNum w:abstractNumId="14" w15:restartNumberingAfterBreak="0">
+  <w:abstractNum w:abstractNumId="18" w15:restartNumberingAfterBreak="0">
     <w:nsid w:val="2C8231CF"/>
     <w:multiLevelType w:val="multilevel"/>
     <w:tmpl w:val="3ABE09A6"/>
@@ -2119,7 +2391,7 @@
       </w:rPr>
     </w:lvl>
   </w:abstractNum>
-  <w:abstractNum w:abstractNumId="15" w15:restartNumberingAfterBreak="0">
+  <w:abstractNum w:abstractNumId="19" w15:restartNumberingAfterBreak="0">
     <w:nsid w:val="2FAC092B"/>
     <w:multiLevelType w:val="multilevel"/>
     <w:tmpl w:val="C93226DA"/>
@@ -2233,7 +2505,7 @@
       </w:rPr>
     </w:lvl>
   </w:abstractNum>
-  <w:abstractNum w:abstractNumId="16" w15:restartNumberingAfterBreak="0">
+  <w:abstractNum w:abstractNumId="20" w15:restartNumberingAfterBreak="0">
     <w:nsid w:val="3CDB6CD0"/>
     <w:multiLevelType w:val="multilevel"/>
     <w:tmpl w:val="C5CE0304"/>
@@ -2386,7 +2658,7 @@
       </w:rPr>
     </w:lvl>
   </w:abstractNum>
-  <w:abstractNum w:abstractNumId="17" w15:restartNumberingAfterBreak="0">
+  <w:abstractNum w:abstractNumId="21" w15:restartNumberingAfterBreak="0">
     <w:nsid w:val="62366BE9"/>
     <w:multiLevelType w:val="hybridMultilevel"/>
     <w:tmpl w:val="32041FD0"/>
@@ -2527,147 +2799,7 @@
       </w:rPr>
     </w:lvl>
   </w:abstractNum>
-  <w:abstractNum w:abstractNumId="18" w15:restartNumberingAfterBreak="0">
-    <w:nsid w:val="624710C6"/>
-    <w:multiLevelType w:val="hybridMultilevel"/>
-    <w:tmpl w:val="6BA2BDF8"/>
-    <w:lvl w:ilvl="0" w:tplc="0E8EC746">
-      <w:start w:val="1"/>
-      <w:numFmt w:val="bullet"/>
-      <w:lvlText w:val=""/>
-      <w:lvlJc w:val="left"/>
-      <w:pPr>
-        <w:tabs>
-          <w:tab w:val="num" w:pos="284"/>
-        </w:tabs>
-        <w:ind w:left="284" w:hanging="284"/>
-      </w:pPr>
-      <w:rPr>
-        <w:rFonts w:ascii="Symbol" w:hAnsi="Symbol" w:hint="default"/>
-      </w:rPr>
-    </w:lvl>
-    <w:lvl w:ilvl="1" w:tplc="08070001">
-      <w:start w:val="1"/>
-      <w:numFmt w:val="bullet"/>
-      <w:lvlText w:val=""/>
-      <w:lvlJc w:val="left"/>
-      <w:pPr>
-        <w:tabs>
-          <w:tab w:val="num" w:pos="1440"/>
-        </w:tabs>
-        <w:ind w:left="1440" w:hanging="360"/>
-      </w:pPr>
-      <w:rPr>
-        <w:rFonts w:ascii="Symbol" w:hAnsi="Symbol" w:hint="default"/>
-      </w:rPr>
-    </w:lvl>
-    <w:lvl w:ilvl="2" w:tplc="08070005" w:tentative="1">
-      <w:start w:val="1"/>
-      <w:numFmt w:val="bullet"/>
-      <w:lvlText w:val=""/>
-      <w:lvlJc w:val="left"/>
-      <w:pPr>
-        <w:tabs>
-          <w:tab w:val="num" w:pos="2160"/>
-        </w:tabs>
-        <w:ind w:left="2160" w:hanging="360"/>
-      </w:pPr>
-      <w:rPr>
-        <w:rFonts w:ascii="Wingdings" w:hAnsi="Wingdings" w:hint="default"/>
-      </w:rPr>
-    </w:lvl>
-    <w:lvl w:ilvl="3" w:tplc="08070001" w:tentative="1">
-      <w:start w:val="1"/>
-      <w:numFmt w:val="bullet"/>
-      <w:lvlText w:val=""/>
-      <w:lvlJc w:val="left"/>
-      <w:pPr>
-        <w:tabs>
-          <w:tab w:val="num" w:pos="2880"/>
-        </w:tabs>
-        <w:ind w:left="2880" w:hanging="360"/>
-      </w:pPr>
-      <w:rPr>
-        <w:rFonts w:ascii="Symbol" w:hAnsi="Symbol" w:hint="default"/>
-      </w:rPr>
-    </w:lvl>
-    <w:lvl w:ilvl="4" w:tplc="08070003" w:tentative="1">
-      <w:start w:val="1"/>
-      <w:numFmt w:val="bullet"/>
-      <w:lvlText w:val="o"/>
-      <w:lvlJc w:val="left"/>
-      <w:pPr>
-        <w:tabs>
-          <w:tab w:val="num" w:pos="3600"/>
-        </w:tabs>
-        <w:ind w:left="3600" w:hanging="360"/>
-      </w:pPr>
-      <w:rPr>
-        <w:rFonts w:ascii="Courier New" w:hAnsi="Courier New" w:hint="default"/>
-      </w:rPr>
-    </w:lvl>
-    <w:lvl w:ilvl="5" w:tplc="08070005" w:tentative="1">
-      <w:start w:val="1"/>
-      <w:numFmt w:val="bullet"/>
-      <w:lvlText w:val=""/>
-      <w:lvlJc w:val="left"/>
-      <w:pPr>
-        <w:tabs>
-          <w:tab w:val="num" w:pos="4320"/>
-        </w:tabs>
-        <w:ind w:left="4320" w:hanging="360"/>
-      </w:pPr>
-      <w:rPr>
-        <w:rFonts w:ascii="Wingdings" w:hAnsi="Wingdings" w:hint="default"/>
-      </w:rPr>
-    </w:lvl>
-    <w:lvl w:ilvl="6" w:tplc="08070001" w:tentative="1">
-      <w:start w:val="1"/>
-      <w:numFmt w:val="bullet"/>
-      <w:lvlText w:val=""/>
-      <w:lvlJc w:val="left"/>
-      <w:pPr>
-        <w:tabs>
-          <w:tab w:val="num" w:pos="5040"/>
-        </w:tabs>
-        <w:ind w:left="5040" w:hanging="360"/>
-      </w:pPr>
-      <w:rPr>
-        <w:rFonts w:ascii="Symbol" w:hAnsi="Symbol" w:hint="default"/>
-      </w:rPr>
-    </w:lvl>
-    <w:lvl w:ilvl="7" w:tplc="08070003" w:tentative="1">
-      <w:start w:val="1"/>
-      <w:numFmt w:val="bullet"/>
-      <w:lvlText w:val="o"/>
-      <w:lvlJc w:val="left"/>
-      <w:pPr>
-        <w:tabs>
-          <w:tab w:val="num" w:pos="5760"/>
-        </w:tabs>
-        <w:ind w:left="5760" w:hanging="360"/>
-      </w:pPr>
-      <w:rPr>
-        <w:rFonts w:ascii="Courier New" w:hAnsi="Courier New" w:hint="default"/>
-      </w:rPr>
-    </w:lvl>
-    <w:lvl w:ilvl="8" w:tplc="08070005" w:tentative="1">
-      <w:start w:val="1"/>
-      <w:numFmt w:val="bullet"/>
-      <w:lvlText w:val=""/>
-      <w:lvlJc w:val="left"/>
-      <w:pPr>
-        <w:tabs>
-          <w:tab w:val="num" w:pos="6480"/>
-        </w:tabs>
-        <w:ind w:left="6480" w:hanging="360"/>
-      </w:pPr>
-      <w:rPr>
-        <w:rFonts w:ascii="Wingdings" w:hAnsi="Wingdings" w:hint="default"/>
-      </w:rPr>
-    </w:lvl>
-  </w:abstractNum>
-  <w:abstractNum w:abstractNumId="19" w15:restartNumberingAfterBreak="0">
+  <w:abstractNum w:abstractNumId="22" w15:restartNumberingAfterBreak="0">
     <w:nsid w:val="66E11CDA"/>
     <w:multiLevelType w:val="multilevel"/>
     <w:tmpl w:val="D14853E4"/>
@@ -2781,147 +2913,7 @@
       </w:rPr>
     </w:lvl>
   </w:abstractNum>
-  <w:abstractNum w:abstractNumId="20" w15:restartNumberingAfterBreak="0">
-    <w:nsid w:val="6D82622C"/>
-    <w:multiLevelType w:val="hybridMultilevel"/>
-    <w:tmpl w:val="E09E8924"/>
-    <w:lvl w:ilvl="0" w:tplc="0E8EC746">
-      <w:start w:val="1"/>
-      <w:numFmt w:val="bullet"/>
-      <w:lvlText w:val=""/>
-      <w:lvlJc w:val="left"/>
-      <w:pPr>
-        <w:tabs>
-          <w:tab w:val="num" w:pos="284"/>
-        </w:tabs>
-        <w:ind w:left="284" w:hanging="284"/>
-      </w:pPr>
-      <w:rPr>
-        <w:rFonts w:ascii="Symbol" w:hAnsi="Symbol" w:hint="default"/>
-      </w:rPr>
-    </w:lvl>
-    <w:lvl w:ilvl="1" w:tplc="08070003" w:tentative="1">
-      <w:start w:val="1"/>
-      <w:numFmt w:val="bullet"/>
-      <w:lvlText w:val="o"/>
-      <w:lvlJc w:val="left"/>
-      <w:pPr>
-        <w:tabs>
-          <w:tab w:val="num" w:pos="1440"/>
-        </w:tabs>
-        <w:ind w:left="1440" w:hanging="360"/>
-      </w:pPr>
-      <w:rPr>
-        <w:rFonts w:ascii="Courier New" w:hAnsi="Courier New" w:hint="default"/>
-      </w:rPr>
-    </w:lvl>
-    <w:lvl w:ilvl="2" w:tplc="08070005" w:tentative="1">
-      <w:start w:val="1"/>
-      <w:numFmt w:val="bullet"/>
-      <w:lvlText w:val=""/>
-      <w:lvlJc w:val="left"/>
-      <w:pPr>
-        <w:tabs>
-          <w:tab w:val="num" w:pos="2160"/>
-        </w:tabs>
-        <w:ind w:left="2160" w:hanging="360"/>
-      </w:pPr>
-      <w:rPr>
-        <w:rFonts w:ascii="Wingdings" w:hAnsi="Wingdings" w:hint="default"/>
-      </w:rPr>
-    </w:lvl>
-    <w:lvl w:ilvl="3" w:tplc="08070001" w:tentative="1">
-      <w:start w:val="1"/>
-      <w:numFmt w:val="bullet"/>
-      <w:lvlText w:val=""/>
-      <w:lvlJc w:val="left"/>
-      <w:pPr>
-        <w:tabs>
-          <w:tab w:val="num" w:pos="2880"/>
-        </w:tabs>
-        <w:ind w:left="2880" w:hanging="360"/>
-      </w:pPr>
-      <w:rPr>
-        <w:rFonts w:ascii="Symbol" w:hAnsi="Symbol" w:hint="default"/>
-      </w:rPr>
-    </w:lvl>
-    <w:lvl w:ilvl="4" w:tplc="08070003" w:tentative="1">
-      <w:start w:val="1"/>
-      <w:numFmt w:val="bullet"/>
-      <w:lvlText w:val="o"/>
-      <w:lvlJc w:val="left"/>
-      <w:pPr>
-        <w:tabs>
-          <w:tab w:val="num" w:pos="3600"/>
-        </w:tabs>
-        <w:ind w:left="3600" w:hanging="360"/>
-      </w:pPr>
-      <w:rPr>
-        <w:rFonts w:ascii="Courier New" w:hAnsi="Courier New" w:hint="default"/>
-      </w:rPr>
-    </w:lvl>
-    <w:lvl w:ilvl="5" w:tplc="08070005" w:tentative="1">
-      <w:start w:val="1"/>
-      <w:numFmt w:val="bullet"/>
-      <w:lvlText w:val=""/>
-      <w:lvlJc w:val="left"/>
-      <w:pPr>
-        <w:tabs>
-          <w:tab w:val="num" w:pos="4320"/>
-        </w:tabs>
-        <w:ind w:left="4320" w:hanging="360"/>
-      </w:pPr>
-      <w:rPr>
-        <w:rFonts w:ascii="Wingdings" w:hAnsi="Wingdings" w:hint="default"/>
-      </w:rPr>
-    </w:lvl>
-    <w:lvl w:ilvl="6" w:tplc="08070001" w:tentative="1">
-      <w:start w:val="1"/>
-      <w:numFmt w:val="bullet"/>
-      <w:lvlText w:val=""/>
-      <w:lvlJc w:val="left"/>
-      <w:pPr>
-        <w:tabs>
-          <w:tab w:val="num" w:pos="5040"/>
-        </w:tabs>
-        <w:ind w:left="5040" w:hanging="360"/>
-      </w:pPr>
-      <w:rPr>
-        <w:rFonts w:ascii="Symbol" w:hAnsi="Symbol" w:hint="default"/>
-      </w:rPr>
-    </w:lvl>
-    <w:lvl w:ilvl="7" w:tplc="08070003" w:tentative="1">
-      <w:start w:val="1"/>
-      <w:numFmt w:val="bullet"/>
-      <w:lvlText w:val="o"/>
-      <w:lvlJc w:val="left"/>
-      <w:pPr>
-        <w:tabs>
-          <w:tab w:val="num" w:pos="5760"/>
-        </w:tabs>
-        <w:ind w:left="5760" w:hanging="360"/>
-      </w:pPr>
-      <w:rPr>
-        <w:rFonts w:ascii="Courier New" w:hAnsi="Courier New" w:hint="default"/>
-      </w:rPr>
-    </w:lvl>
-    <w:lvl w:ilvl="8" w:tplc="08070005" w:tentative="1">
-      <w:start w:val="1"/>
-      <w:numFmt w:val="bullet"/>
-      <w:lvlText w:val=""/>
-      <w:lvlJc w:val="left"/>
-      <w:pPr>
-        <w:tabs>
-          <w:tab w:val="num" w:pos="6480"/>
-        </w:tabs>
-        <w:ind w:left="6480" w:hanging="360"/>
-      </w:pPr>
-      <w:rPr>
-        <w:rFonts w:ascii="Wingdings" w:hAnsi="Wingdings" w:hint="default"/>
-      </w:rPr>
-    </w:lvl>
-  </w:abstractNum>
-  <w:abstractNum w:abstractNumId="21" w15:restartNumberingAfterBreak="0">
+  <w:abstractNum w:abstractNumId="23" w15:restartNumberingAfterBreak="0">
     <w:nsid w:val="79952C31"/>
     <w:multiLevelType w:val="multilevel"/>
     <w:tmpl w:val="3826664E"/>
@@ -3035,7 +3027,7 @@
       </w:rPr>
     </w:lvl>
   </w:abstractNum>
-  <w:abstractNum w:abstractNumId="22" w15:restartNumberingAfterBreak="0">
+  <w:abstractNum w:abstractNumId="24" w15:restartNumberingAfterBreak="0">
     <w:nsid w:val="7ADC1B1C"/>
     <w:multiLevelType w:val="multilevel"/>
     <w:tmpl w:val="41D87CB8"/>
@@ -3174,147 +3166,7 @@
       </w:rPr>
     </w:lvl>
   </w:abstractNum>
-  <w:abstractNum w:abstractNumId="23" w15:restartNumberingAfterBreak="0">
-    <w:nsid w:val="7CEA6866"/>
-    <w:multiLevelType w:val="hybridMultilevel"/>
-    <w:tmpl w:val="9A7893A6"/>
-    <w:lvl w:ilvl="0" w:tplc="FFFFFFFF">
-      <w:start w:val="1"/>
-      <w:numFmt w:val="bullet"/>
-      <w:lvlText w:val=""/>
-      <w:lvlJc w:val="left"/>
-      <w:pPr>
-        <w:tabs>
-          <w:tab w:val="num" w:pos="284"/>
-        </w:tabs>
-        <w:ind w:left="284" w:hanging="284"/>
-      </w:pPr>
-      <w:rPr>
-        <w:rFonts w:ascii="Symbol" w:hAnsi="Symbol" w:hint="default"/>
-      </w:rPr>
-    </w:lvl>
-    <w:lvl w:ilvl="1" w:tplc="FFFFFFFF" w:tentative="1">
-      <w:start w:val="1"/>
-      <w:numFmt w:val="bullet"/>
-      <w:lvlText w:val="o"/>
-      <w:lvlJc w:val="left"/>
-      <w:pPr>
-        <w:tabs>
-          <w:tab w:val="num" w:pos="1440"/>
-        </w:tabs>
-        <w:ind w:left="1440" w:hanging="360"/>
-      </w:pPr>
-      <w:rPr>
-        <w:rFonts w:ascii="Courier New" w:hAnsi="Courier New" w:hint="default"/>
-      </w:rPr>
-    </w:lvl>
-    <w:lvl w:ilvl="2" w:tplc="FFFFFFFF" w:tentative="1">
-      <w:start w:val="1"/>
-      <w:numFmt w:val="bullet"/>
-      <w:lvlText w:val=""/>
-      <w:lvlJc w:val="left"/>
-      <w:pPr>
-        <w:tabs>
-          <w:tab w:val="num" w:pos="2160"/>
-        </w:tabs>
-        <w:ind w:left="2160" w:hanging="360"/>
-      </w:pPr>
-      <w:rPr>
-        <w:rFonts w:ascii="Wingdings" w:hAnsi="Wingdings" w:hint="default"/>
-      </w:rPr>
-    </w:lvl>
-    <w:lvl w:ilvl="3" w:tplc="FFFFFFFF" w:tentative="1">
-      <w:start w:val="1"/>
-      <w:numFmt w:val="bullet"/>
-      <w:lvlText w:val=""/>
-      <w:lvlJc w:val="left"/>
-      <w:pPr>
-        <w:tabs>
-          <w:tab w:val="num" w:pos="2880"/>
-        </w:tabs>
-        <w:ind w:left="2880" w:hanging="360"/>
-      </w:pPr>
-      <w:rPr>
-        <w:rFonts w:ascii="Symbol" w:hAnsi="Symbol" w:hint="default"/>
-      </w:rPr>
-    </w:lvl>
-    <w:lvl w:ilvl="4" w:tplc="FFFFFFFF" w:tentative="1">
-      <w:start w:val="1"/>
-      <w:numFmt w:val="bullet"/>
-      <w:lvlText w:val="o"/>
-      <w:lvlJc w:val="left"/>
-      <w:pPr>
-        <w:tabs>
-          <w:tab w:val="num" w:pos="3600"/>
-        </w:tabs>
-        <w:ind w:left="3600" w:hanging="360"/>
-      </w:pPr>
-      <w:rPr>
-        <w:rFonts w:ascii="Courier New" w:hAnsi="Courier New" w:hint="default"/>
-      </w:rPr>
-    </w:lvl>
-    <w:lvl w:ilvl="5" w:tplc="FFFFFFFF" w:tentative="1">
-      <w:start w:val="1"/>
-      <w:numFmt w:val="bullet"/>
-      <w:lvlText w:val=""/>
-      <w:lvlJc w:val="left"/>
-      <w:pPr>
-        <w:tabs>
-          <w:tab w:val="num" w:pos="4320"/>
-        </w:tabs>
-        <w:ind w:left="4320" w:hanging="360"/>
-      </w:pPr>
-      <w:rPr>
-        <w:rFonts w:ascii="Wingdings" w:hAnsi="Wingdings" w:hint="default"/>
-      </w:rPr>
-    </w:lvl>
-    <w:lvl w:ilvl="6" w:tplc="FFFFFFFF" w:tentative="1">
-      <w:start w:val="1"/>
-      <w:numFmt w:val="bullet"/>
-      <w:lvlText w:val=""/>
-      <w:lvlJc w:val="left"/>
-      <w:pPr>
-        <w:tabs>
-          <w:tab w:val="num" w:pos="5040"/>
-        </w:tabs>
-        <w:ind w:left="5040" w:hanging="360"/>
-      </w:pPr>
-      <w:rPr>
-        <w:rFonts w:ascii="Symbol" w:hAnsi="Symbol" w:hint="default"/>
-      </w:rPr>
-    </w:lvl>
-    <w:lvl w:ilvl="7" w:tplc="FFFFFFFF" w:tentative="1">
-      <w:start w:val="1"/>
-      <w:numFmt w:val="bullet"/>
-      <w:lvlText w:val="o"/>
-      <w:lvlJc w:val="left"/>
-      <w:pPr>
-        <w:tabs>
-          <w:tab w:val="num" w:pos="5760"/>
-        </w:tabs>
-        <w:ind w:left="5760" w:hanging="360"/>
-      </w:pPr>
-      <w:rPr>
-        <w:rFonts w:ascii="Courier New" w:hAnsi="Courier New" w:hint="default"/>
-      </w:rPr>
-    </w:lvl>
-    <w:lvl w:ilvl="8" w:tplc="FFFFFFFF" w:tentative="1">
-      <w:start w:val="1"/>
-      <w:numFmt w:val="bullet"/>
-      <w:lvlText w:val=""/>
-      <w:lvlJc w:val="left"/>
-      <w:pPr>
-        <w:tabs>
-          <w:tab w:val="num" w:pos="6480"/>
-        </w:tabs>
-        <w:ind w:left="6480" w:hanging="360"/>
-      </w:pPr>
-      <w:rPr>
-        <w:rFonts w:ascii="Wingdings" w:hAnsi="Wingdings" w:hint="default"/>
-      </w:rPr>
-    </w:lvl>
-  </w:abstractNum>
-  <w:abstractNum w:abstractNumId="24" w15:restartNumberingAfterBreak="0">
+  <w:abstractNum w:abstractNumId="25" w15:restartNumberingAfterBreak="0">
     <w:nsid w:val="7F326723"/>
     <w:multiLevelType w:val="multilevel"/>
     <w:tmpl w:val="4E928C16"/>
@@ -3432,142 +3284,94 @@
       </w:rPr>
     </w:lvl>
   </w:abstractNum>
-  <w:num w:numId="1" w16cid:durableId="966132169">
+  <w:num w:numId="1" w16cid:durableId="1686787673">
+    <w:abstractNumId w:val="21"/>
+  </w:num>
+  <w:num w:numId="2" w16cid:durableId="897209477">
+    <w:abstractNumId w:val="12"/>
+  </w:num>
+  <w:num w:numId="3" w16cid:durableId="908660104">
+    <w:abstractNumId w:val="13"/>
+  </w:num>
+  <w:num w:numId="4" w16cid:durableId="2097701445">
+    <w:abstractNumId w:val="22"/>
+  </w:num>
+  <w:num w:numId="5" w16cid:durableId="502864998">
+    <w:abstractNumId w:val="20"/>
+  </w:num>
+  <w:num w:numId="6" w16cid:durableId="607934757">
+    <w:abstractNumId w:val="24"/>
+  </w:num>
+  <w:num w:numId="7" w16cid:durableId="386270051">
+    <w:abstractNumId w:val="16"/>
+  </w:num>
+  <w:num w:numId="8" w16cid:durableId="1089303606">
+    <w:abstractNumId w:val="23"/>
+  </w:num>
+  <w:num w:numId="9" w16cid:durableId="1561746642">
     <w:abstractNumId w:val="17"/>
   </w:num>
-  <w:num w:numId="2" w16cid:durableId="1752654859">
+  <w:num w:numId="10" w16cid:durableId="1036079686">
     <w:abstractNumId w:val="19"/>
   </w:num>
-  <w:num w:numId="3" w16cid:durableId="441147667">
-    <w:abstractNumId w:val="16"/>
+  <w:num w:numId="11" w16cid:durableId="323321810">
+    <w:abstractNumId w:val="25"/>
   </w:num>
-  <w:num w:numId="4" w16cid:durableId="709259632">
-    <w:abstractNumId w:val="22"/>
+  <w:num w:numId="12" w16cid:durableId="1467157608">
+    <w:abstractNumId w:val="9"/>
   </w:num>
-  <w:num w:numId="5" w16cid:durableId="1937715680">
-    <w:abstractNumId w:val="12"/>
+  <w:num w:numId="13" w16cid:durableId="1759403760">
+    <w:abstractNumId w:val="18"/>
   </w:num>
-  <w:num w:numId="6" w16cid:durableId="912547508">
-    <w:abstractNumId w:val="21"/>
+  <w:num w:numId="14" w16cid:durableId="766969181">
+    <w:abstractNumId w:val="10"/>
   </w:num>
-  <w:num w:numId="7" w16cid:durableId="1992517127">
-    <w:abstractNumId w:val="13"/>
+  <w:num w:numId="15" w16cid:durableId="1936479813">
+    <w:abstractNumId w:val="7"/>
   </w:num>
-  <w:num w:numId="8" w16cid:durableId="1507553330">
+  <w:num w:numId="16" w16cid:durableId="193620320">
+    <w:abstractNumId w:val="6"/>
+  </w:num>
+  <w:num w:numId="17" w16cid:durableId="731807342">
+    <w:abstractNumId w:val="5"/>
+  </w:num>
+  <w:num w:numId="18" w16cid:durableId="1484197611">
+    <w:abstractNumId w:val="4"/>
+  </w:num>
+  <w:num w:numId="19" w16cid:durableId="1128474731">
+    <w:abstractNumId w:val="8"/>
+  </w:num>
+  <w:num w:numId="20" w16cid:durableId="1741249039">
+    <w:abstractNumId w:val="3"/>
+  </w:num>
+  <w:num w:numId="21" w16cid:durableId="709571214">
+    <w:abstractNumId w:val="2"/>
+  </w:num>
+  <w:num w:numId="22" w16cid:durableId="1090388491">
+    <w:abstractNumId w:val="1"/>
+  </w:num>
+  <w:num w:numId="23" w16cid:durableId="1710490270">
+    <w:abstractNumId w:val="0"/>
+  </w:num>
+  <w:num w:numId="24" w16cid:durableId="924726235">
+    <w:abstractNumId w:val="18"/>
+  </w:num>
+  <w:num w:numId="25" w16cid:durableId="1935244024">
+    <w:abstractNumId w:val="18"/>
+  </w:num>
+  <w:num w:numId="26" w16cid:durableId="2124379943">
+    <w:abstractNumId w:val="10"/>
+  </w:num>
+  <w:num w:numId="27" w16cid:durableId="1841385813">
+    <w:abstractNumId w:val="11"/>
+  </w:num>
+  <w:num w:numId="28" w16cid:durableId="2010058492">
+    <w:abstractNumId w:val="14"/>
+  </w:num>
+  <w:num w:numId="29" w16cid:durableId="932974209">
     <w:abstractNumId w:val="15"/>
   </w:num>
-  <w:num w:numId="9" w16cid:durableId="796214923">
-    <w:abstractNumId w:val="24"/>
-  </w:num>
-  <w:num w:numId="10" w16cid:durableId="1061362695">
-    <w:abstractNumId w:val="9"/>
-  </w:num>
-  <w:num w:numId="11" w16cid:durableId="134418579">
-    <w:abstractNumId w:val="14"/>
-  </w:num>
-  <w:num w:numId="12" w16cid:durableId="444889155">
-    <w:abstractNumId w:val="10"/>
-  </w:num>
-  <w:num w:numId="13" w16cid:durableId="1754358439">
-    <w:abstractNumId w:val="19"/>
-  </w:num>
-  <w:num w:numId="14" w16cid:durableId="824784680">
-    <w:abstractNumId w:val="16"/>
-  </w:num>
-  <w:num w:numId="15" w16cid:durableId="1840778465">
-    <w:abstractNumId w:val="22"/>
-  </w:num>
-  <w:num w:numId="16" w16cid:durableId="1808430617">
-    <w:abstractNumId w:val="12"/>
-  </w:num>
-  <w:num w:numId="17" w16cid:durableId="2142112069">
-    <w:abstractNumId w:val="21"/>
-  </w:num>
-  <w:num w:numId="18" w16cid:durableId="2024822496">
-    <w:abstractNumId w:val="13"/>
-  </w:num>
-  <w:num w:numId="19" w16cid:durableId="417680263">
-    <w:abstractNumId w:val="15"/>
-  </w:num>
-  <w:num w:numId="20" w16cid:durableId="811479158">
-    <w:abstractNumId w:val="24"/>
-  </w:num>
-  <w:num w:numId="21" w16cid:durableId="2077361150">
-    <w:abstractNumId w:val="9"/>
-  </w:num>
-  <w:num w:numId="22" w16cid:durableId="384067926">
-    <w:abstractNumId w:val="14"/>
-  </w:num>
-  <w:num w:numId="23" w16cid:durableId="1759669930">
-    <w:abstractNumId w:val="10"/>
-  </w:num>
-  <w:num w:numId="24" w16cid:durableId="897132634">
-    <w:abstractNumId w:val="10"/>
-  </w:num>
-  <w:num w:numId="25" w16cid:durableId="70934371">
-    <w:abstractNumId w:val="10"/>
-  </w:num>
-  <w:num w:numId="26" w16cid:durableId="528564312">
-    <w:abstractNumId w:val="10"/>
-  </w:num>
-  <w:num w:numId="27" w16cid:durableId="761493582">
-    <w:abstractNumId w:val="10"/>
-  </w:num>
-  <w:num w:numId="28" w16cid:durableId="718093755">
-    <w:abstractNumId w:val="10"/>
-  </w:num>
-  <w:num w:numId="29" w16cid:durableId="885675822">
-    <w:abstractNumId w:val="10"/>
-  </w:num>
-  <w:num w:numId="30" w16cid:durableId="544492353">
-    <w:abstractNumId w:val="10"/>
-  </w:num>
-  <w:num w:numId="31" w16cid:durableId="41754094">
-    <w:abstractNumId w:val="10"/>
-  </w:num>
-  <w:num w:numId="32" w16cid:durableId="617294105">
-    <w:abstractNumId w:val="7"/>
-  </w:num>
-  <w:num w:numId="33" w16cid:durableId="110825677">
-    <w:abstractNumId w:val="6"/>
-  </w:num>
-  <w:num w:numId="34" w16cid:durableId="571309639">
-    <w:abstractNumId w:val="5"/>
-  </w:num>
-  <w:num w:numId="35" w16cid:durableId="1070693146">
-    <w:abstractNumId w:val="4"/>
-  </w:num>
-  <w:num w:numId="36" w16cid:durableId="4018892">
-    <w:abstractNumId w:val="8"/>
-  </w:num>
-  <w:num w:numId="37" w16cid:durableId="1050035330">
-    <w:abstractNumId w:val="3"/>
-  </w:num>
-  <w:num w:numId="38" w16cid:durableId="2040817091">
-    <w:abstractNumId w:val="2"/>
-  </w:num>
-  <w:num w:numId="39" w16cid:durableId="1520461030">
-    <w:abstractNumId w:val="1"/>
-  </w:num>
-  <w:num w:numId="40" w16cid:durableId="802429694">
-    <w:abstractNumId w:val="0"/>
-  </w:num>
-  <w:num w:numId="41" w16cid:durableId="1673676857">
-    <w:abstractNumId w:val="23"/>
-  </w:num>
-  <w:num w:numId="42" w16cid:durableId="1282616555">
-    <w:abstractNumId w:val="20"/>
-  </w:num>
-  <w:num w:numId="43" w16cid:durableId="1469475993">
-    <w:abstractNumId w:val="18"/>
-  </w:num>
-  <w:num w:numId="44" w16cid:durableId="178006393">
-    <w:abstractNumId w:val="10"/>
-  </w:num>
-  <w:num w:numId="45" w16cid:durableId="609437935">
-    <w:abstractNumId w:val="10"/>
-  </w:num>
-  <w:numIdMacAtCleanup w:val="12"/>
+  <w:numIdMacAtCleanup w:val="14"/>
 </w:numbering>
 </file>
 
@@ -3952,7 +3756,7 @@
   <w:style w:type="paragraph" w:default="1" w:styleId="Standard">
     <w:name w:val="Normal"/>
     <w:qFormat/>
-    <w:rsid w:val="00AB36B3"/>
+    <w:rsid w:val="00A13DF3"/>
     <w:pPr>
       <w:adjustRightInd w:val="0"/>
       <w:snapToGrid w:val="0"/>
@@ -3969,12 +3773,12 @@
     <w:next w:val="Blocktext"/>
     <w:link w:val="berschrift1Zchn"/>
     <w:qFormat/>
-    <w:rsid w:val="00AB36B3"/>
+    <w:rsid w:val="00A13DF3"/>
     <w:pPr>
       <w:keepNext/>
       <w:keepLines/>
       <w:numPr>
-        <w:numId w:val="31"/>
+        <w:numId w:val="14"/>
       </w:numPr>
       <w:spacing w:before="420"/>
       <w:outlineLvl w:val="0"/>
@@ -3993,13 +3797,13 @@
     <w:next w:val="Blocktext"/>
     <w:link w:val="berschrift2Zchn"/>
     <w:qFormat/>
-    <w:rsid w:val="00AB36B3"/>
+    <w:rsid w:val="00A13DF3"/>
     <w:pPr>
       <w:keepNext/>
       <w:keepLines/>
       <w:numPr>
         <w:ilvl w:val="1"/>
-        <w:numId w:val="31"/>
+        <w:numId w:val="14"/>
       </w:numPr>
       <w:spacing w:before="280"/>
       <w:outlineLvl w:val="1"/>
@@ -4018,13 +3822,13 @@
     <w:next w:val="Blocktext"/>
     <w:link w:val="berschrift3Zchn"/>
     <w:qFormat/>
-    <w:rsid w:val="00AB36B3"/>
+    <w:rsid w:val="00A13DF3"/>
     <w:pPr>
       <w:keepNext/>
       <w:keepLines/>
       <w:numPr>
         <w:ilvl w:val="2"/>
-        <w:numId w:val="31"/>
+        <w:numId w:val="14"/>
       </w:numPr>
       <w:outlineLvl w:val="2"/>
     </w:pPr>
@@ -4040,13 +3844,13 @@
     <w:basedOn w:val="Blocktext"/>
     <w:next w:val="Blocktext"/>
     <w:link w:val="berschrift4Zchn"/>
-    <w:rsid w:val="00AB36B3"/>
+    <w:rsid w:val="00A13DF3"/>
     <w:pPr>
       <w:keepNext/>
       <w:keepLines/>
       <w:numPr>
         <w:ilvl w:val="3"/>
-        <w:numId w:val="31"/>
+        <w:numId w:val="14"/>
       </w:numPr>
       <w:outlineLvl w:val="3"/>
     </w:pPr>
@@ -4061,13 +3865,13 @@
     <w:basedOn w:val="Blocktext"/>
     <w:next w:val="Blocktext"/>
     <w:link w:val="berschrift5Zchn"/>
-    <w:rsid w:val="00AB36B3"/>
+    <w:rsid w:val="00A13DF3"/>
     <w:pPr>
       <w:keepNext/>
       <w:keepLines/>
       <w:numPr>
         <w:ilvl w:val="4"/>
-        <w:numId w:val="31"/>
+        <w:numId w:val="14"/>
       </w:numPr>
       <w:outlineLvl w:val="4"/>
     </w:pPr>
@@ -4083,13 +3887,13 @@
     <w:basedOn w:val="Blocktext"/>
     <w:next w:val="Blocktext"/>
     <w:link w:val="berschrift6Zchn"/>
-    <w:rsid w:val="00AB36B3"/>
+    <w:rsid w:val="00A13DF3"/>
     <w:pPr>
       <w:keepNext/>
       <w:keepLines/>
       <w:numPr>
         <w:ilvl w:val="5"/>
-        <w:numId w:val="31"/>
+        <w:numId w:val="14"/>
       </w:numPr>
       <w:outlineLvl w:val="5"/>
     </w:pPr>
@@ -4104,13 +3908,13 @@
     <w:basedOn w:val="Blocktext"/>
     <w:next w:val="Blocktext"/>
     <w:link w:val="berschrift7Zchn"/>
-    <w:rsid w:val="00AB36B3"/>
+    <w:rsid w:val="00A13DF3"/>
     <w:pPr>
       <w:keepNext/>
       <w:keepLines/>
       <w:numPr>
         <w:ilvl w:val="6"/>
-        <w:numId w:val="31"/>
+        <w:numId w:val="14"/>
       </w:numPr>
       <w:outlineLvl w:val="6"/>
     </w:pPr>
@@ -4123,13 +3927,13 @@
     <w:basedOn w:val="Blocktext"/>
     <w:next w:val="Blocktext"/>
     <w:link w:val="berschrift8Zchn"/>
-    <w:rsid w:val="00AB36B3"/>
+    <w:rsid w:val="00A13DF3"/>
     <w:pPr>
       <w:keepNext/>
       <w:keepLines/>
       <w:numPr>
         <w:ilvl w:val="7"/>
-        <w:numId w:val="31"/>
+        <w:numId w:val="14"/>
       </w:numPr>
       <w:outlineLvl w:val="7"/>
     </w:pPr>
@@ -4143,13 +3947,13 @@
     <w:basedOn w:val="Blocktext"/>
     <w:next w:val="Blocktext"/>
     <w:link w:val="berschrift9Zchn"/>
-    <w:rsid w:val="00AB36B3"/>
+    <w:rsid w:val="00A13DF3"/>
     <w:pPr>
       <w:keepNext/>
       <w:keepLines/>
       <w:numPr>
         <w:ilvl w:val="8"/>
-        <w:numId w:val="31"/>
+        <w:numId w:val="14"/>
       </w:numPr>
       <w:outlineLvl w:val="8"/>
     </w:pPr>
@@ -4189,7 +3993,7 @@
   <w:style w:type="table" w:styleId="Tabellenraster">
     <w:name w:val="Table Grid"/>
     <w:basedOn w:val="NormaleTabelle"/>
-    <w:rsid w:val="00AB36B3"/>
+    <w:rsid w:val="00A13DF3"/>
     <w:pPr>
       <w:spacing w:line="260" w:lineRule="exact"/>
     </w:pPr>
@@ -4216,7 +4020,7 @@
     <w:name w:val="header"/>
     <w:basedOn w:val="Standard"/>
     <w:link w:val="KopfzeileZchn"/>
-    <w:rsid w:val="00AB36B3"/>
+    <w:rsid w:val="00A13DF3"/>
     <w:rPr>
       <w:sz w:val="17"/>
     </w:rPr>
@@ -4225,7 +4029,7 @@
     <w:name w:val="footer"/>
     <w:basedOn w:val="Standard"/>
     <w:link w:val="FuzeileZchn"/>
-    <w:rsid w:val="00AB36B3"/>
+    <w:rsid w:val="00A13DF3"/>
     <w:pPr>
       <w:spacing w:line="240" w:lineRule="auto"/>
     </w:pPr>
@@ -4238,7 +4042,7 @@
     <w:basedOn w:val="Standard"/>
     <w:next w:val="Standard"/>
     <w:uiPriority w:val="39"/>
-    <w:rsid w:val="00AB36B3"/>
+    <w:rsid w:val="00A13DF3"/>
     <w:pPr>
       <w:tabs>
         <w:tab w:val="right" w:leader="dot" w:pos="8959"/>
@@ -4255,7 +4059,7 @@
     <w:basedOn w:val="Standard"/>
     <w:next w:val="Standard"/>
     <w:uiPriority w:val="39"/>
-    <w:rsid w:val="00AB36B3"/>
+    <w:rsid w:val="00A13DF3"/>
     <w:pPr>
       <w:tabs>
         <w:tab w:val="right" w:leader="dot" w:pos="8959"/>
@@ -4269,7 +4073,7 @@
     <w:next w:val="Standard"/>
     <w:autoRedefine/>
     <w:uiPriority w:val="39"/>
-    <w:rsid w:val="00AB36B3"/>
+    <w:rsid w:val="00A13DF3"/>
     <w:pPr>
       <w:tabs>
         <w:tab w:val="right" w:leader="dot" w:pos="8959"/>
@@ -4281,7 +4085,7 @@
     <w:name w:val="Hyperlink"/>
     <w:basedOn w:val="Absatz-Standardschriftart"/>
     <w:uiPriority w:val="99"/>
-    <w:rsid w:val="00AB36B3"/>
+    <w:rsid w:val="00A13DF3"/>
     <w:rPr>
       <w:dstrike w:val="0"/>
       <w:color w:val="000000" w:themeColor="text1"/>
@@ -4293,7 +4097,7 @@
     <w:name w:val="Balloon Text"/>
     <w:basedOn w:val="Standard"/>
     <w:link w:val="SprechblasentextZchn"/>
-    <w:rsid w:val="00AB36B3"/>
+    <w:rsid w:val="00A13DF3"/>
     <w:pPr>
       <w:keepLines/>
     </w:pPr>
@@ -4307,7 +4111,7 @@
     <w:name w:val="caption"/>
     <w:basedOn w:val="Standard"/>
     <w:next w:val="Standard"/>
-    <w:rsid w:val="00AB36B3"/>
+    <w:rsid w:val="00A13DF3"/>
     <w:pPr>
       <w:keepLines/>
     </w:pPr>
@@ -4321,7 +4125,7 @@
   <w:style w:type="character" w:styleId="Kommentarzeichen">
     <w:name w:val="annotation reference"/>
     <w:basedOn w:val="Absatz-Standardschriftart"/>
-    <w:rsid w:val="00AB36B3"/>
+    <w:rsid w:val="00A13DF3"/>
     <w:rPr>
       <w:sz w:val="14"/>
       <w:szCs w:val="16"/>
@@ -4331,7 +4135,7 @@
     <w:name w:val="annotation text"/>
     <w:basedOn w:val="Standard"/>
     <w:link w:val="KommentartextZchn"/>
-    <w:rsid w:val="00AB36B3"/>
+    <w:rsid w:val="00A13DF3"/>
     <w:rPr>
       <w:sz w:val="14"/>
       <w:szCs w:val="20"/>
@@ -4342,7 +4146,7 @@
     <w:basedOn w:val="Kommentartext"/>
     <w:next w:val="Kommentartext"/>
     <w:link w:val="KommentarthemaZchn"/>
-    <w:rsid w:val="00AB36B3"/>
+    <w:rsid w:val="00A13DF3"/>
     <w:rPr>
       <w:b/>
       <w:bCs/>
@@ -4352,7 +4156,7 @@
     <w:name w:val="Document Map"/>
     <w:basedOn w:val="Standard"/>
     <w:link w:val="DokumentstrukturZchn"/>
-    <w:rsid w:val="00AB36B3"/>
+    <w:rsid w:val="00A13DF3"/>
     <w:rPr>
       <w:rFonts w:cs="Tahoma"/>
       <w:szCs w:val="20"/>
@@ -4361,7 +4165,7 @@
   <w:style w:type="character" w:styleId="Endnotenzeichen">
     <w:name w:val="endnote reference"/>
     <w:basedOn w:val="Absatz-Standardschriftart"/>
-    <w:rsid w:val="00AB36B3"/>
+    <w:rsid w:val="00A13DF3"/>
     <w:rPr>
       <w:vertAlign w:val="superscript"/>
     </w:rPr>
@@ -4370,7 +4174,7 @@
     <w:name w:val="endnote text"/>
     <w:basedOn w:val="Standard"/>
     <w:link w:val="EndnotentextZchn"/>
-    <w:rsid w:val="00AB36B3"/>
+    <w:rsid w:val="00A13DF3"/>
     <w:rPr>
       <w:sz w:val="14"/>
       <w:szCs w:val="20"/>
@@ -4379,7 +4183,7 @@
   <w:style w:type="character" w:styleId="Funotenzeichen">
     <w:name w:val="footnote reference"/>
     <w:basedOn w:val="Absatz-Standardschriftart"/>
-    <w:rsid w:val="00AB36B3"/>
+    <w:rsid w:val="00A13DF3"/>
     <w:rPr>
       <w:vertAlign w:val="superscript"/>
     </w:rPr>
@@ -4388,7 +4192,7 @@
     <w:name w:val="footnote text"/>
     <w:basedOn w:val="Standard"/>
     <w:link w:val="FunotentextZchn"/>
-    <w:rsid w:val="00AB36B3"/>
+    <w:rsid w:val="00A13DF3"/>
     <w:rPr>
       <w:sz w:val="14"/>
       <w:szCs w:val="20"/>
@@ -4399,7 +4203,7 @@
     <w:basedOn w:val="Standard"/>
     <w:next w:val="Standard"/>
     <w:autoRedefine/>
-    <w:rsid w:val="00AB36B3"/>
+    <w:rsid w:val="00A13DF3"/>
     <w:pPr>
       <w:ind w:left="284" w:hanging="284"/>
     </w:pPr>
@@ -4409,7 +4213,7 @@
     <w:basedOn w:val="Standard"/>
     <w:next w:val="Standard"/>
     <w:autoRedefine/>
-    <w:rsid w:val="00AB36B3"/>
+    <w:rsid w:val="00A13DF3"/>
     <w:pPr>
       <w:ind w:left="568" w:hanging="284"/>
     </w:pPr>
@@ -4419,7 +4223,7 @@
     <w:basedOn w:val="Standard"/>
     <w:next w:val="Standard"/>
     <w:autoRedefine/>
-    <w:rsid w:val="00AB36B3"/>
+    <w:rsid w:val="00A13DF3"/>
     <w:pPr>
       <w:ind w:left="851" w:hanging="284"/>
     </w:pPr>
@@ -4429,7 +4233,7 @@
     <w:basedOn w:val="Standard"/>
     <w:next w:val="Standard"/>
     <w:autoRedefine/>
-    <w:rsid w:val="00AB36B3"/>
+    <w:rsid w:val="00A13DF3"/>
     <w:pPr>
       <w:ind w:left="1135" w:hanging="284"/>
     </w:pPr>
@@ -4439,7 +4243,7 @@
     <w:basedOn w:val="Standard"/>
     <w:next w:val="Standard"/>
     <w:autoRedefine/>
-    <w:rsid w:val="00AB36B3"/>
+    <w:rsid w:val="00A13DF3"/>
     <w:pPr>
       <w:ind w:left="1418" w:hanging="284"/>
     </w:pPr>
@@ -4449,7 +4253,7 @@
     <w:basedOn w:val="Standard"/>
     <w:next w:val="Standard"/>
     <w:autoRedefine/>
-    <w:rsid w:val="00AB36B3"/>
+    <w:rsid w:val="00A13DF3"/>
     <w:pPr>
       <w:ind w:left="1702" w:hanging="284"/>
     </w:pPr>
@@ -4459,7 +4263,7 @@
     <w:basedOn w:val="Standard"/>
     <w:next w:val="Standard"/>
     <w:autoRedefine/>
-    <w:rsid w:val="00AB36B3"/>
+    <w:rsid w:val="00A13DF3"/>
     <w:pPr>
       <w:ind w:left="1985" w:hanging="284"/>
     </w:pPr>
@@ -4469,7 +4273,7 @@
     <w:basedOn w:val="Standard"/>
     <w:next w:val="Standard"/>
     <w:autoRedefine/>
-    <w:rsid w:val="00AB36B3"/>
+    <w:rsid w:val="00A13DF3"/>
     <w:pPr>
       <w:ind w:left="2269" w:hanging="284"/>
     </w:pPr>
@@ -4479,7 +4283,7 @@
     <w:basedOn w:val="Standard"/>
     <w:next w:val="Standard"/>
     <w:autoRedefine/>
-    <w:rsid w:val="00AB36B3"/>
+    <w:rsid w:val="00A13DF3"/>
     <w:pPr>
       <w:ind w:left="2552" w:hanging="284"/>
     </w:pPr>
@@ -4488,7 +4292,7 @@
     <w:name w:val="index heading"/>
     <w:basedOn w:val="Standard"/>
     <w:next w:val="Index1"/>
-    <w:rsid w:val="00AB36B3"/>
+    <w:rsid w:val="00A13DF3"/>
     <w:pPr>
       <w:keepNext/>
       <w:keepLines/>
@@ -4502,7 +4306,7 @@
   <w:style w:type="paragraph" w:styleId="Makrotext">
     <w:name w:val="macro"/>
     <w:link w:val="MakrotextZchn"/>
-    <w:rsid w:val="00AB36B3"/>
+    <w:rsid w:val="00A13DF3"/>
     <w:rPr>
       <w:rFonts w:ascii="Verdana" w:hAnsi="Verdana" w:cs="Courier New"/>
       <w:sz w:val="22"/>
@@ -4512,7 +4316,7 @@
     <w:name w:val="table of authorities"/>
     <w:basedOn w:val="Standard"/>
     <w:next w:val="Standard"/>
-    <w:rsid w:val="00AB36B3"/>
+    <w:rsid w:val="00A13DF3"/>
     <w:pPr>
       <w:ind w:left="284" w:hanging="284"/>
     </w:pPr>
@@ -4521,13 +4325,13 @@
     <w:name w:val="table of figures"/>
     <w:basedOn w:val="Standard"/>
     <w:next w:val="Standard"/>
-    <w:rsid w:val="00AB36B3"/>
+    <w:rsid w:val="00A13DF3"/>
   </w:style>
   <w:style w:type="paragraph" w:styleId="RGV-berschrift">
     <w:name w:val="toa heading"/>
     <w:basedOn w:val="Standard"/>
     <w:next w:val="Standard"/>
-    <w:rsid w:val="00AB36B3"/>
+    <w:rsid w:val="00A13DF3"/>
     <w:pPr>
       <w:keepNext/>
       <w:keepLines/>
@@ -4543,7 +4347,7 @@
     <w:basedOn w:val="Standard"/>
     <w:next w:val="Standard"/>
     <w:uiPriority w:val="39"/>
-    <w:rsid w:val="00AB36B3"/>
+    <w:rsid w:val="00A13DF3"/>
     <w:pPr>
       <w:tabs>
         <w:tab w:val="right" w:leader="dot" w:pos="8959"/>
@@ -4556,7 +4360,7 @@
     <w:basedOn w:val="Standard"/>
     <w:next w:val="Standard"/>
     <w:uiPriority w:val="39"/>
-    <w:rsid w:val="00AB36B3"/>
+    <w:rsid w:val="00A13DF3"/>
     <w:pPr>
       <w:tabs>
         <w:tab w:val="right" w:leader="dot" w:pos="8959"/>
@@ -4569,7 +4373,7 @@
     <w:basedOn w:val="Standard"/>
     <w:next w:val="Standard"/>
     <w:uiPriority w:val="39"/>
-    <w:rsid w:val="00AB36B3"/>
+    <w:rsid w:val="00A13DF3"/>
     <w:pPr>
       <w:tabs>
         <w:tab w:val="right" w:leader="dot" w:pos="8959"/>
@@ -4582,7 +4386,7 @@
     <w:basedOn w:val="Standard"/>
     <w:next w:val="Standard"/>
     <w:uiPriority w:val="39"/>
-    <w:rsid w:val="00AB36B3"/>
+    <w:rsid w:val="00A13DF3"/>
     <w:pPr>
       <w:tabs>
         <w:tab w:val="right" w:leader="dot" w:pos="8959"/>
@@ -4595,7 +4399,7 @@
     <w:basedOn w:val="Standard"/>
     <w:next w:val="Standard"/>
     <w:uiPriority w:val="39"/>
-    <w:rsid w:val="00AB36B3"/>
+    <w:rsid w:val="00A13DF3"/>
     <w:pPr>
       <w:tabs>
         <w:tab w:val="right" w:leader="dot" w:pos="8959"/>
@@ -4608,7 +4412,7 @@
     <w:basedOn w:val="Standard"/>
     <w:next w:val="Standard"/>
     <w:uiPriority w:val="39"/>
-    <w:rsid w:val="00AB36B3"/>
+    <w:rsid w:val="00A13DF3"/>
     <w:pPr>
       <w:tabs>
         <w:tab w:val="right" w:leader="dot" w:pos="8959"/>
@@ -4622,7 +4426,7 @@
     <w:next w:val="Blocktext"/>
     <w:link w:val="TitelZchn"/>
     <w:qFormat/>
-    <w:rsid w:val="00AB36B3"/>
+    <w:rsid w:val="00A13DF3"/>
     <w:pPr>
       <w:keepNext/>
       <w:keepLines/>
@@ -4639,7 +4443,7 @@
     <w:name w:val="Betreff"/>
     <w:basedOn w:val="Standard"/>
     <w:qFormat/>
-    <w:rsid w:val="00AB36B3"/>
+    <w:rsid w:val="00A13DF3"/>
     <w:pPr>
       <w:spacing w:after="280"/>
     </w:pPr>
@@ -4653,7 +4457,7 @@
     <w:next w:val="Standard"/>
     <w:link w:val="UntertitelZchn"/>
     <w:qFormat/>
-    <w:rsid w:val="00AB36B3"/>
+    <w:rsid w:val="00A13DF3"/>
     <w:pPr>
       <w:keepNext/>
       <w:keepLines/>
@@ -4671,7 +4475,7 @@
     <w:name w:val="Strong"/>
     <w:basedOn w:val="Absatz-Standardschriftart"/>
     <w:qFormat/>
-    <w:rsid w:val="00AB36B3"/>
+    <w:rsid w:val="00A13DF3"/>
     <w:rPr>
       <w:rFonts w:ascii="Arial" w:hAnsi="Arial"/>
       <w:b/>
@@ -4682,7 +4486,7 @@
     <w:name w:val="Beschreibung"/>
     <w:basedOn w:val="Absatz-Standardschriftart"/>
     <w:qFormat/>
-    <w:rsid w:val="00AB36B3"/>
+    <w:rsid w:val="00A13DF3"/>
     <w:rPr>
       <w:sz w:val="16"/>
     </w:rPr>
@@ -4691,7 +4495,7 @@
     <w:name w:val="Closing"/>
     <w:basedOn w:val="Standard"/>
     <w:link w:val="GruformelZchn"/>
-    <w:rsid w:val="00AB36B3"/>
+    <w:rsid w:val="00A13DF3"/>
     <w:pPr>
       <w:keepNext/>
       <w:keepLines/>
@@ -4702,7 +4506,7 @@
     <w:name w:val="Separator"/>
     <w:basedOn w:val="Standard"/>
     <w:next w:val="Standard"/>
-    <w:rsid w:val="00AB36B3"/>
+    <w:rsid w:val="00A13DF3"/>
     <w:pPr>
       <w:pBdr>
         <w:bottom w:val="single" w:sz="4" w:space="1" w:color="auto"/>
@@ -4712,7 +4516,7 @@
   <w:style w:type="paragraph" w:customStyle="1" w:styleId="Topic300">
     <w:name w:val="Topic300"/>
     <w:basedOn w:val="Standard"/>
-    <w:rsid w:val="00AB36B3"/>
+    <w:rsid w:val="00A13DF3"/>
     <w:pPr>
       <w:keepLines/>
       <w:ind w:left="1701" w:hanging="1701"/>
@@ -4721,7 +4525,7 @@
   <w:style w:type="paragraph" w:customStyle="1" w:styleId="Topic600">
     <w:name w:val="Topic600"/>
     <w:basedOn w:val="Blocktext"/>
-    <w:rsid w:val="00AB36B3"/>
+    <w:rsid w:val="00A13DF3"/>
     <w:pPr>
       <w:keepLines/>
       <w:ind w:left="3402" w:hanging="3402"/>
@@ -4730,7 +4534,7 @@
   <w:style w:type="paragraph" w:customStyle="1" w:styleId="Topic900">
     <w:name w:val="Topic900"/>
     <w:basedOn w:val="Blocktext"/>
-    <w:rsid w:val="00AB36B3"/>
+    <w:rsid w:val="00A13DF3"/>
     <w:pPr>
       <w:keepLines/>
       <w:ind w:left="5103" w:hanging="5103"/>
@@ -4739,7 +4543,7 @@
   <w:style w:type="paragraph" w:customStyle="1" w:styleId="Topic075">
     <w:name w:val="Topic075"/>
     <w:basedOn w:val="Blocktext"/>
-    <w:rsid w:val="00AB36B3"/>
+    <w:rsid w:val="00A13DF3"/>
     <w:pPr>
       <w:keepLines/>
       <w:ind w:left="425" w:hanging="425"/>
@@ -4750,7 +4554,7 @@
     <w:basedOn w:val="Standard"/>
     <w:link w:val="UnterschriftZchn"/>
     <w:qFormat/>
-    <w:rsid w:val="00AB36B3"/>
+    <w:rsid w:val="00A13DF3"/>
     <w:pPr>
       <w:keepNext/>
       <w:keepLines/>
@@ -4759,7 +4563,7 @@
   <w:style w:type="character" w:styleId="Hervorhebung">
     <w:name w:val="Emphasis"/>
     <w:basedOn w:val="Absatz-Standardschriftart"/>
-    <w:rsid w:val="00AB36B3"/>
+    <w:rsid w:val="00A13DF3"/>
     <w:rPr>
       <w:b/>
       <w:iCs/>
@@ -4768,7 +4572,7 @@
   <w:style w:type="character" w:styleId="BesuchterLink">
     <w:name w:val="FollowedHyperlink"/>
     <w:basedOn w:val="Absatz-Standardschriftart"/>
-    <w:rsid w:val="00AB36B3"/>
+    <w:rsid w:val="00A13DF3"/>
     <w:rPr>
       <w:dstrike w:val="0"/>
       <w:u w:val="none"/>
@@ -4778,17 +4582,17 @@
   <w:style w:type="paragraph" w:customStyle="1" w:styleId="Beilagen">
     <w:name w:val="Beilagen"/>
     <w:basedOn w:val="AuflistungmitSymbolen"/>
-    <w:rsid w:val="00AB36B3"/>
+    <w:rsid w:val="00A13DF3"/>
     <w:pPr>
       <w:numPr>
-        <w:numId w:val="22"/>
+        <w:numId w:val="13"/>
       </w:numPr>
     </w:pPr>
   </w:style>
   <w:style w:type="paragraph" w:customStyle="1" w:styleId="zOawDeliveryOption">
     <w:name w:val="zOawDeliveryOption"/>
     <w:basedOn w:val="Standard"/>
-    <w:rsid w:val="00AB36B3"/>
+    <w:rsid w:val="00A13DF3"/>
     <w:rPr>
       <w:b/>
     </w:rPr>
@@ -4796,7 +4600,7 @@
   <w:style w:type="paragraph" w:customStyle="1" w:styleId="zOawDeliveryOption2">
     <w:name w:val="zOawDeliveryOption2"/>
     <w:basedOn w:val="Standard"/>
-    <w:rsid w:val="00AB36B3"/>
+    <w:rsid w:val="00A13DF3"/>
     <w:rPr>
       <w:b/>
     </w:rPr>
@@ -4804,16 +4608,16 @@
   <w:style w:type="paragraph" w:customStyle="1" w:styleId="zOawRecipient">
     <w:name w:val="zOawRecipient"/>
     <w:basedOn w:val="Standard"/>
-    <w:rsid w:val="00AB36B3"/>
+    <w:rsid w:val="00A13DF3"/>
   </w:style>
   <w:style w:type="paragraph" w:customStyle="1" w:styleId="AuflistungmitNummern">
     <w:name w:val="Auflistung mit Nummern"/>
     <w:basedOn w:val="Standard"/>
     <w:qFormat/>
-    <w:rsid w:val="00AB36B3"/>
+    <w:rsid w:val="00A13DF3"/>
     <w:pPr>
       <w:numPr>
-        <w:numId w:val="18"/>
+        <w:numId w:val="9"/>
       </w:numPr>
     </w:pPr>
   </w:style>
@@ -4821,10 +4625,10 @@
     <w:name w:val="Auflistung mit Symbolen mit Abstand"/>
     <w:basedOn w:val="Blocktext"/>
     <w:qFormat/>
-    <w:rsid w:val="00AB36B3"/>
+    <w:rsid w:val="00A13DF3"/>
     <w:pPr>
       <w:numPr>
-        <w:numId w:val="20"/>
+        <w:numId w:val="11"/>
       </w:numPr>
     </w:pPr>
   </w:style>
@@ -4832,10 +4636,10 @@
     <w:name w:val="Auflistung mit Buchstaben"/>
     <w:basedOn w:val="Standard"/>
     <w:qFormat/>
-    <w:rsid w:val="00AB36B3"/>
+    <w:rsid w:val="00A13DF3"/>
     <w:pPr>
       <w:numPr>
-        <w:numId w:val="14"/>
+        <w:numId w:val="5"/>
       </w:numPr>
     </w:pPr>
   </w:style>
@@ -4843,7 +4647,7 @@
     <w:name w:val="Dokument Typ"/>
     <w:basedOn w:val="Blocktext"/>
     <w:next w:val="Blocktext"/>
-    <w:rsid w:val="00AB36B3"/>
+    <w:rsid w:val="00A13DF3"/>
     <w:rPr>
       <w:b/>
       <w:caps/>
@@ -4853,7 +4657,7 @@
     <w:name w:val="OutputprofileTitle"/>
     <w:basedOn w:val="Standard"/>
     <w:next w:val="OutputprofileText"/>
-    <w:rsid w:val="00AB36B3"/>
+    <w:rsid w:val="00A13DF3"/>
     <w:pPr>
       <w:keepLines/>
     </w:pPr>
@@ -4865,7 +4669,7 @@
   <w:style w:type="paragraph" w:customStyle="1" w:styleId="OutputprofileText">
     <w:name w:val="OutputprofileText"/>
     <w:basedOn w:val="Standard"/>
-    <w:rsid w:val="00AB36B3"/>
+    <w:rsid w:val="00A13DF3"/>
     <w:pPr>
       <w:keepLines/>
     </w:pPr>
@@ -4877,7 +4681,7 @@
     <w:name w:val="Block Text"/>
     <w:basedOn w:val="Standard"/>
     <w:qFormat/>
-    <w:rsid w:val="00AB36B3"/>
+    <w:rsid w:val="00A13DF3"/>
     <w:pPr>
       <w:spacing w:after="140"/>
     </w:pPr>
@@ -4886,19 +4690,19 @@
     <w:name w:val="Body Text"/>
     <w:basedOn w:val="Standard"/>
     <w:link w:val="TextkrperZchn"/>
-    <w:rsid w:val="00AB36B3"/>
+    <w:rsid w:val="00A13DF3"/>
   </w:style>
   <w:style w:type="paragraph" w:styleId="Textkrper2">
     <w:name w:val="Body Text 2"/>
     <w:basedOn w:val="Standard"/>
     <w:link w:val="Textkrper2Zchn"/>
-    <w:rsid w:val="00AB36B3"/>
+    <w:rsid w:val="00A13DF3"/>
   </w:style>
   <w:style w:type="paragraph" w:styleId="Textkrper3">
     <w:name w:val="Body Text 3"/>
     <w:basedOn w:val="Standard"/>
     <w:link w:val="Textkrper3Zchn"/>
-    <w:rsid w:val="00AB36B3"/>
+    <w:rsid w:val="00A13DF3"/>
     <w:rPr>
       <w:szCs w:val="16"/>
     </w:rPr>
@@ -4907,31 +4711,31 @@
     <w:name w:val="Body Text First Indent"/>
     <w:basedOn w:val="Textkrper"/>
     <w:link w:val="Textkrper-ErstzeileneinzugZchn"/>
-    <w:rsid w:val="00AB36B3"/>
+    <w:rsid w:val="00A13DF3"/>
   </w:style>
   <w:style w:type="paragraph" w:styleId="Textkrper-Zeileneinzug">
     <w:name w:val="Body Text Indent"/>
     <w:basedOn w:val="Standard"/>
     <w:link w:val="Textkrper-ZeileneinzugZchn"/>
-    <w:rsid w:val="00AB36B3"/>
+    <w:rsid w:val="00A13DF3"/>
   </w:style>
   <w:style w:type="paragraph" w:styleId="Textkrper-Erstzeileneinzug2">
     <w:name w:val="Body Text First Indent 2"/>
     <w:basedOn w:val="Textkrper-Zeileneinzug"/>
     <w:link w:val="Textkrper-Erstzeileneinzug2Zchn"/>
-    <w:rsid w:val="00AB36B3"/>
+    <w:rsid w:val="00A13DF3"/>
   </w:style>
   <w:style w:type="paragraph" w:styleId="Textkrper-Einzug2">
     <w:name w:val="Body Text Indent 2"/>
     <w:basedOn w:val="Standard"/>
     <w:link w:val="Textkrper-Einzug2Zchn"/>
-    <w:rsid w:val="00AB36B3"/>
+    <w:rsid w:val="00A13DF3"/>
   </w:style>
   <w:style w:type="paragraph" w:styleId="Textkrper-Einzug3">
     <w:name w:val="Body Text Indent 3"/>
     <w:basedOn w:val="Standard"/>
     <w:link w:val="Textkrper-Einzug3Zchn"/>
-    <w:rsid w:val="00AB36B3"/>
+    <w:rsid w:val="00A13DF3"/>
     <w:rPr>
       <w:szCs w:val="16"/>
     </w:rPr>
@@ -4939,7 +4743,7 @@
   <w:style w:type="paragraph" w:styleId="Umschlagadresse">
     <w:name w:val="envelope address"/>
     <w:basedOn w:val="Standard"/>
-    <w:rsid w:val="00AB36B3"/>
+    <w:rsid w:val="00A13DF3"/>
     <w:pPr>
       <w:framePr w:w="4320" w:h="2160" w:hRule="exact" w:hSpace="141" w:wrap="auto" w:hAnchor="page" w:xAlign="center" w:yAlign="bottom"/>
       <w:ind w:left="1"/>
@@ -4951,7 +4755,7 @@
   <w:style w:type="paragraph" w:styleId="Umschlagabsenderadresse">
     <w:name w:val="envelope return"/>
     <w:basedOn w:val="Standard"/>
-    <w:rsid w:val="00AB36B3"/>
+    <w:rsid w:val="00A13DF3"/>
     <w:rPr>
       <w:rFonts w:cs="Arial"/>
       <w:szCs w:val="20"/>
@@ -4961,7 +4765,7 @@
     <w:name w:val="HTML Address"/>
     <w:basedOn w:val="Standard"/>
     <w:link w:val="HTMLAdresseZchn"/>
-    <w:rsid w:val="00AB36B3"/>
+    <w:rsid w:val="00A13DF3"/>
     <w:rPr>
       <w:iCs/>
     </w:rPr>
@@ -4969,7 +4773,7 @@
   <w:style w:type="character" w:styleId="HTMLZitat">
     <w:name w:val="HTML Cite"/>
     <w:basedOn w:val="Absatz-Standardschriftart"/>
-    <w:rsid w:val="00AB36B3"/>
+    <w:rsid w:val="00A13DF3"/>
     <w:rPr>
       <w:iCs/>
     </w:rPr>
@@ -4977,7 +4781,7 @@
   <w:style w:type="character" w:styleId="HTMLCode">
     <w:name w:val="HTML Code"/>
     <w:basedOn w:val="Absatz-Standardschriftart"/>
-    <w:rsid w:val="00AB36B3"/>
+    <w:rsid w:val="00A13DF3"/>
     <w:rPr>
       <w:rFonts w:ascii="Verdana" w:hAnsi="Verdana" w:cs="Courier New"/>
       <w:sz w:val="22"/>
@@ -4987,7 +4791,7 @@
   <w:style w:type="character" w:styleId="HTMLDefinition">
     <w:name w:val="HTML Definition"/>
     <w:basedOn w:val="Absatz-Standardschriftart"/>
-    <w:rsid w:val="00AB36B3"/>
+    <w:rsid w:val="00A13DF3"/>
     <w:rPr>
       <w:iCs/>
     </w:rPr>
@@ -4995,7 +4799,7 @@
   <w:style w:type="character" w:styleId="HTMLTastatur">
     <w:name w:val="HTML Keyboard"/>
     <w:basedOn w:val="Absatz-Standardschriftart"/>
-    <w:rsid w:val="00AB36B3"/>
+    <w:rsid w:val="00A13DF3"/>
     <w:rPr>
       <w:rFonts w:ascii="Verdana" w:hAnsi="Verdana" w:cs="Courier New"/>
       <w:sz w:val="22"/>
@@ -5006,7 +4810,7 @@
     <w:name w:val="HTML Preformatted"/>
     <w:basedOn w:val="Standard"/>
     <w:link w:val="HTMLVorformatiertZchn"/>
-    <w:rsid w:val="00AB36B3"/>
+    <w:rsid w:val="00A13DF3"/>
     <w:rPr>
       <w:rFonts w:cs="Courier New"/>
       <w:szCs w:val="20"/>
@@ -5015,7 +4819,7 @@
   <w:style w:type="character" w:styleId="HTMLBeispiel">
     <w:name w:val="HTML Sample"/>
     <w:basedOn w:val="Absatz-Standardschriftart"/>
-    <w:rsid w:val="00AB36B3"/>
+    <w:rsid w:val="00A13DF3"/>
     <w:rPr>
       <w:rFonts w:ascii="Verdana" w:hAnsi="Verdana" w:cs="Courier New"/>
       <w:sz w:val="22"/>
@@ -5024,7 +4828,7 @@
   <w:style w:type="character" w:styleId="HTMLSchreibmaschine">
     <w:name w:val="HTML Typewriter"/>
     <w:basedOn w:val="Absatz-Standardschriftart"/>
-    <w:rsid w:val="00AB36B3"/>
+    <w:rsid w:val="00A13DF3"/>
     <w:rPr>
       <w:rFonts w:ascii="Verdana" w:hAnsi="Verdana" w:cs="Courier New"/>
       <w:sz w:val="20"/>
@@ -5034,7 +4838,7 @@
   <w:style w:type="character" w:styleId="HTMLVariable">
     <w:name w:val="HTML Variable"/>
     <w:basedOn w:val="Absatz-Standardschriftart"/>
-    <w:rsid w:val="00AB36B3"/>
+    <w:rsid w:val="00A13DF3"/>
     <w:rPr>
       <w:iCs/>
     </w:rPr>
@@ -5042,12 +4846,12 @@
   <w:style w:type="character" w:styleId="Zeilennummer">
     <w:name w:val="line number"/>
     <w:basedOn w:val="Absatz-Standardschriftart"/>
-    <w:rsid w:val="00AB36B3"/>
+    <w:rsid w:val="00A13DF3"/>
   </w:style>
   <w:style w:type="paragraph" w:styleId="Liste">
     <w:name w:val="List"/>
     <w:basedOn w:val="Standard"/>
-    <w:rsid w:val="00AB36B3"/>
+    <w:rsid w:val="00A13DF3"/>
     <w:pPr>
       <w:ind w:left="283" w:hanging="283"/>
     </w:pPr>
@@ -5055,7 +4859,7 @@
   <w:style w:type="paragraph" w:styleId="Liste2">
     <w:name w:val="List 2"/>
     <w:basedOn w:val="Standard"/>
-    <w:rsid w:val="00AB36B3"/>
+    <w:rsid w:val="00A13DF3"/>
     <w:pPr>
       <w:ind w:left="566" w:hanging="283"/>
     </w:pPr>
@@ -5063,7 +4867,7 @@
   <w:style w:type="paragraph" w:styleId="Liste3">
     <w:name w:val="List 3"/>
     <w:basedOn w:val="Standard"/>
-    <w:rsid w:val="00AB36B3"/>
+    <w:rsid w:val="00A13DF3"/>
     <w:pPr>
       <w:ind w:left="849" w:hanging="283"/>
     </w:pPr>
@@ -5071,7 +4875,7 @@
   <w:style w:type="paragraph" w:styleId="Liste4">
     <w:name w:val="List 4"/>
     <w:basedOn w:val="Standard"/>
-    <w:rsid w:val="00AB36B3"/>
+    <w:rsid w:val="00A13DF3"/>
     <w:pPr>
       <w:ind w:left="1132" w:hanging="283"/>
     </w:pPr>
@@ -5079,7 +4883,7 @@
   <w:style w:type="paragraph" w:styleId="Liste5">
     <w:name w:val="List 5"/>
     <w:basedOn w:val="Standard"/>
-    <w:rsid w:val="00AB36B3"/>
+    <w:rsid w:val="00A13DF3"/>
     <w:pPr>
       <w:ind w:left="1415" w:hanging="283"/>
     </w:pPr>
@@ -5088,7 +4892,7 @@
     <w:name w:val="Message Header"/>
     <w:basedOn w:val="Standard"/>
     <w:link w:val="NachrichtenkopfZchn"/>
-    <w:rsid w:val="00AB36B3"/>
+    <w:rsid w:val="00A13DF3"/>
     <w:rPr>
       <w:rFonts w:cs="Arial"/>
       <w:b/>
@@ -5097,12 +4901,12 @@
   <w:style w:type="paragraph" w:styleId="StandardWeb">
     <w:name w:val="Normal (Web)"/>
     <w:basedOn w:val="Standard"/>
-    <w:rsid w:val="00AB36B3"/>
+    <w:rsid w:val="00A13DF3"/>
   </w:style>
   <w:style w:type="paragraph" w:styleId="Standardeinzug">
     <w:name w:val="Normal Indent"/>
     <w:basedOn w:val="Standard"/>
-    <w:rsid w:val="00AB36B3"/>
+    <w:rsid w:val="00A13DF3"/>
     <w:pPr>
       <w:ind w:left="1701"/>
     </w:pPr>
@@ -5112,18 +4916,18 @@
     <w:basedOn w:val="Standard"/>
     <w:next w:val="Standard"/>
     <w:link w:val="Fu-EndnotenberschriftZchn"/>
-    <w:rsid w:val="00AB36B3"/>
+    <w:rsid w:val="00A13DF3"/>
   </w:style>
   <w:style w:type="character" w:styleId="Seitenzahl">
     <w:name w:val="page number"/>
     <w:basedOn w:val="Absatz-Standardschriftart"/>
-    <w:rsid w:val="00AB36B3"/>
+    <w:rsid w:val="00A13DF3"/>
   </w:style>
   <w:style w:type="paragraph" w:styleId="NurText">
     <w:name w:val="Plain Text"/>
     <w:basedOn w:val="Standard"/>
     <w:link w:val="NurTextZchn"/>
-    <w:rsid w:val="00AB36B3"/>
+    <w:rsid w:val="00A13DF3"/>
     <w:rPr>
       <w:rFonts w:cs="Courier New"/>
       <w:szCs w:val="20"/>
@@ -5134,7 +4938,7 @@
     <w:basedOn w:val="Standard"/>
     <w:next w:val="Standard"/>
     <w:link w:val="AnredeZchn"/>
-    <w:rsid w:val="00AB36B3"/>
+    <w:rsid w:val="00A13DF3"/>
     <w:pPr>
       <w:keepLines/>
       <w:spacing w:after="140"/>
@@ -5143,7 +4947,7 @@
   <w:style w:type="table" w:styleId="TabelleSpalten1">
     <w:name w:val="Table Columns 1"/>
     <w:basedOn w:val="NormaleTabelle"/>
-    <w:rsid w:val="00AB36B3"/>
+    <w:rsid w:val="00A13DF3"/>
     <w:pPr>
       <w:adjustRightInd w:val="0"/>
       <w:snapToGrid w:val="0"/>
@@ -5264,7 +5068,7 @@
     <w:basedOn w:val="Standard"/>
     <w:next w:val="Standard"/>
     <w:link w:val="DatumZchn"/>
-    <w:rsid w:val="00AB36B3"/>
+    <w:rsid w:val="00A13DF3"/>
     <w:pPr>
       <w:spacing w:after="280"/>
     </w:pPr>
@@ -5273,10 +5077,10 @@
     <w:name w:val="Auflistung mit Checkboxen"/>
     <w:basedOn w:val="Standard"/>
     <w:qFormat/>
-    <w:rsid w:val="00AB36B3"/>
+    <w:rsid w:val="00A13DF3"/>
     <w:pPr>
       <w:numPr>
-        <w:numId w:val="15"/>
+        <w:numId w:val="6"/>
       </w:numPr>
     </w:pPr>
   </w:style>
@@ -5284,7 +5088,7 @@
     <w:name w:val="Beilagen erste Zeile"/>
     <w:basedOn w:val="Standard"/>
     <w:next w:val="Beilagen"/>
-    <w:rsid w:val="00AB36B3"/>
+    <w:rsid w:val="00A13DF3"/>
     <w:pPr>
       <w:spacing w:before="420"/>
     </w:pPr>
@@ -5292,7 +5096,7 @@
   <w:style w:type="paragraph" w:customStyle="1" w:styleId="Textzusammengehalten">
     <w:name w:val="Text zusammengehalten"/>
     <w:basedOn w:val="Blocktext"/>
-    <w:rsid w:val="00AB36B3"/>
+    <w:rsid w:val="00A13DF3"/>
     <w:pPr>
       <w:keepNext/>
       <w:keepLines/>
@@ -5301,7 +5105,7 @@
   <w:style w:type="paragraph" w:customStyle="1" w:styleId="PositionmitBetrag">
     <w:name w:val="Position mit Betrag"/>
     <w:basedOn w:val="Blocktext"/>
-    <w:rsid w:val="00AB36B3"/>
+    <w:rsid w:val="00A13DF3"/>
     <w:pPr>
       <w:tabs>
         <w:tab w:val="left" w:pos="7371"/>
@@ -5314,7 +5118,7 @@
     <w:name w:val="Unterschrift Linien"/>
     <w:basedOn w:val="Standard"/>
     <w:next w:val="Standard"/>
-    <w:rsid w:val="00AB36B3"/>
+    <w:rsid w:val="00A13DF3"/>
     <w:pPr>
       <w:keepNext/>
       <w:keepLines/>
@@ -5331,7 +5135,7 @@
   <w:style w:type="paragraph" w:customStyle="1" w:styleId="UnterschriftText">
     <w:name w:val="Unterschrift Text"/>
     <w:basedOn w:val="Standard"/>
-    <w:rsid w:val="00AB36B3"/>
+    <w:rsid w:val="00A13DF3"/>
     <w:pPr>
       <w:keepNext/>
       <w:keepLines/>
@@ -5343,7 +5147,7 @@
   <w:style w:type="paragraph" w:customStyle="1" w:styleId="Topic075Line">
     <w:name w:val="Topic075Line"/>
     <w:basedOn w:val="Blocktext"/>
-    <w:rsid w:val="00AB36B3"/>
+    <w:rsid w:val="00A13DF3"/>
     <w:pPr>
       <w:tabs>
         <w:tab w:val="right" w:leader="underscore" w:pos="8959"/>
@@ -5354,7 +5158,7 @@
   <w:style w:type="paragraph" w:customStyle="1" w:styleId="Topic300Line">
     <w:name w:val="Topic300Line"/>
     <w:basedOn w:val="Blocktext"/>
-    <w:rsid w:val="00AB36B3"/>
+    <w:rsid w:val="00A13DF3"/>
     <w:pPr>
       <w:tabs>
         <w:tab w:val="right" w:leader="underscore" w:pos="8959"/>
@@ -5365,7 +5169,7 @@
   <w:style w:type="paragraph" w:customStyle="1" w:styleId="Topic600Line">
     <w:name w:val="Topic600Line"/>
     <w:basedOn w:val="Blocktext"/>
-    <w:rsid w:val="00AB36B3"/>
+    <w:rsid w:val="00A13DF3"/>
     <w:pPr>
       <w:tabs>
         <w:tab w:val="right" w:leader="underscore" w:pos="8959"/>
@@ -5376,7 +5180,7 @@
   <w:style w:type="paragraph" w:customStyle="1" w:styleId="Topic900Line">
     <w:name w:val="Topic900Line"/>
     <w:basedOn w:val="Blocktext"/>
-    <w:rsid w:val="00AB36B3"/>
+    <w:rsid w:val="00A13DF3"/>
     <w:pPr>
       <w:tabs>
         <w:tab w:val="right" w:leader="underscore" w:pos="8959"/>
@@ -5387,7 +5191,7 @@
   <w:style w:type="character" w:customStyle="1" w:styleId="Kursiv">
     <w:name w:val="Kursiv"/>
     <w:basedOn w:val="Absatz-Standardschriftart"/>
-    <w:rsid w:val="00AB36B3"/>
+    <w:rsid w:val="00A13DF3"/>
     <w:rPr>
       <w:i/>
       <w:lang w:val="de-CH"/>
@@ -5400,7 +5204,7 @@
     <w:link w:val="ZitatZchn"/>
     <w:uiPriority w:val="29"/>
     <w:qFormat/>
-    <w:rsid w:val="00AB36B3"/>
+    <w:rsid w:val="00A13DF3"/>
     <w:rPr>
       <w:i/>
       <w:iCs/>
@@ -5412,7 +5216,7 @@
     <w:basedOn w:val="Absatz-Standardschriftart"/>
     <w:link w:val="Zitat"/>
     <w:uiPriority w:val="29"/>
-    <w:rsid w:val="00AB36B3"/>
+    <w:rsid w:val="00A13DF3"/>
     <w:rPr>
       <w:rFonts w:ascii="Arial" w:hAnsi="Arial"/>
       <w:i/>
@@ -5425,7 +5229,7 @@
     <w:name w:val="Subtle Emphasis"/>
     <w:basedOn w:val="Absatz-Standardschriftart"/>
     <w:uiPriority w:val="19"/>
-    <w:rsid w:val="00AB36B3"/>
+    <w:rsid w:val="00A13DF3"/>
     <w:rPr>
       <w:i/>
       <w:iCs/>
@@ -5438,7 +5242,7 @@
     <w:next w:val="Standard"/>
     <w:uiPriority w:val="39"/>
     <w:unhideWhenUsed/>
-    <w:rsid w:val="00AB36B3"/>
+    <w:rsid w:val="00A13DF3"/>
     <w:pPr>
       <w:numPr>
         <w:numId w:val="0"/>
@@ -5457,12 +5261,12 @@
   <w:style w:type="paragraph" w:customStyle="1" w:styleId="UnterschriftFunktion">
     <w:name w:val="Unterschrift Funktion"/>
     <w:basedOn w:val="Unterschrift"/>
-    <w:rsid w:val="00AB36B3"/>
+    <w:rsid w:val="00A13DF3"/>
   </w:style>
   <w:style w:type="paragraph" w:customStyle="1" w:styleId="KopfzeileTitel">
     <w:name w:val="Kopfzeile Titel"/>
     <w:basedOn w:val="Kopfzeile"/>
-    <w:rsid w:val="00AB36B3"/>
+    <w:rsid w:val="00A13DF3"/>
     <w:rPr>
       <w:b/>
     </w:rPr>
@@ -5471,7 +5275,7 @@
     <w:name w:val="Absender Text"/>
     <w:basedOn w:val="Standard"/>
     <w:link w:val="AbsenderTextZchn"/>
-    <w:rsid w:val="00AB36B3"/>
+    <w:rsid w:val="00A13DF3"/>
     <w:pPr>
       <w:spacing w:after="420" w:line="220" w:lineRule="exact"/>
       <w:contextualSpacing/>
@@ -5484,7 +5288,7 @@
     <w:name w:val="Absender Titel Stufe I"/>
     <w:basedOn w:val="Standard"/>
     <w:next w:val="Standard"/>
-    <w:rsid w:val="00AB36B3"/>
+    <w:rsid w:val="00A13DF3"/>
     <w:pPr>
       <w:spacing w:line="260" w:lineRule="exact"/>
     </w:pPr>
@@ -5497,7 +5301,7 @@
   <w:style w:type="paragraph" w:customStyle="1" w:styleId="Referenz">
     <w:name w:val="Referenz"/>
     <w:basedOn w:val="Standard"/>
-    <w:rsid w:val="00AB36B3"/>
+    <w:rsid w:val="00A13DF3"/>
     <w:rPr>
       <w:sz w:val="17"/>
     </w:rPr>
@@ -5505,7 +5309,7 @@
   <w:style w:type="paragraph" w:customStyle="1" w:styleId="Klassifikation">
     <w:name w:val="Klassifikation"/>
     <w:basedOn w:val="Standard"/>
-    <w:rsid w:val="00AB36B3"/>
+    <w:rsid w:val="00A13DF3"/>
     <w:rPr>
       <w:b/>
       <w:sz w:val="17"/>
@@ -5515,7 +5319,7 @@
     <w:name w:val="Absender Titel Stufe II"/>
     <w:basedOn w:val="Standard"/>
     <w:next w:val="AbsenderDistanz"/>
-    <w:rsid w:val="00AB36B3"/>
+    <w:rsid w:val="00A13DF3"/>
     <w:pPr>
       <w:spacing w:line="250" w:lineRule="exact"/>
     </w:pPr>
@@ -5527,7 +5331,7 @@
     <w:name w:val="Tabellentext"/>
     <w:basedOn w:val="Standard"/>
     <w:qFormat/>
-    <w:rsid w:val="00AB36B3"/>
+    <w:rsid w:val="00A13DF3"/>
     <w:pPr>
       <w:adjustRightInd/>
       <w:snapToGrid/>
@@ -5540,7 +5344,7 @@
   <w:style w:type="table" w:styleId="Tabelle3D-Effekt1">
     <w:name w:val="Table 3D effects 1"/>
     <w:basedOn w:val="NormaleTabelle"/>
-    <w:rsid w:val="00AB36B3"/>
+    <w:rsid w:val="00A13DF3"/>
     <w:pPr>
       <w:adjustRightInd w:val="0"/>
       <w:snapToGrid w:val="0"/>
@@ -5661,7 +5465,7 @@
     <w:name w:val="Table Simple 3"/>
     <w:aliases w:val="Tabelle Kopfzeile"/>
     <w:basedOn w:val="NormaleTabelle"/>
-    <w:rsid w:val="00AB36B3"/>
+    <w:rsid w:val="00A13DF3"/>
     <w:pPr>
       <w:adjustRightInd w:val="0"/>
       <w:snapToGrid w:val="0"/>
@@ -5715,10 +5519,10 @@
     <w:name w:val="Auflistung Hinweis"/>
     <w:basedOn w:val="AuflistungmitBuchstaben"/>
     <w:qFormat/>
-    <w:rsid w:val="00AB36B3"/>
+    <w:rsid w:val="00A13DF3"/>
     <w:pPr>
       <w:numPr>
-        <w:numId w:val="13"/>
+        <w:numId w:val="4"/>
       </w:numPr>
     </w:pPr>
   </w:style>
@@ -5726,10 +5530,10 @@
     <w:name w:val="Auflistung mit römischen Nummern"/>
     <w:basedOn w:val="AuflistungmitBuchstaben"/>
     <w:qFormat/>
-    <w:rsid w:val="00AB36B3"/>
+    <w:rsid w:val="00A13DF3"/>
     <w:pPr>
       <w:numPr>
-        <w:numId w:val="19"/>
+        <w:numId w:val="10"/>
       </w:numPr>
     </w:pPr>
   </w:style>
@@ -5737,7 +5541,7 @@
     <w:name w:val="Auflistung mit Symbolen"/>
     <w:basedOn w:val="AuflistungmitSymbolenmitAbstand"/>
     <w:qFormat/>
-    <w:rsid w:val="00AB36B3"/>
+    <w:rsid w:val="00A13DF3"/>
     <w:pPr>
       <w:numPr>
         <w:numId w:val="0"/>
@@ -5749,7 +5553,7 @@
     <w:name w:val="Table Elegant"/>
     <w:aliases w:val="Tabelle Struktur"/>
     <w:basedOn w:val="NormaleTabelle"/>
-    <w:rsid w:val="00AB36B3"/>
+    <w:rsid w:val="00A13DF3"/>
     <w:pPr>
       <w:adjustRightInd w:val="0"/>
       <w:snapToGrid w:val="0"/>
@@ -5808,7 +5612,7 @@
   <w:style w:type="table" w:styleId="TabelleEinfach2">
     <w:name w:val="Table Simple 2"/>
     <w:basedOn w:val="NormaleTabelle"/>
-    <w:rsid w:val="00AB36B3"/>
+    <w:rsid w:val="00A13DF3"/>
     <w:pPr>
       <w:adjustRightInd w:val="0"/>
       <w:snapToGrid w:val="0"/>
@@ -5937,7 +5741,7 @@
     <w:name w:val="Fazit"/>
     <w:basedOn w:val="Standard"/>
     <w:qFormat/>
-    <w:rsid w:val="00AB36B3"/>
+    <w:rsid w:val="00A13DF3"/>
     <w:pPr>
       <w:pBdr>
         <w:top w:val="single" w:sz="4" w:space="4" w:color="auto"/>
@@ -5953,7 +5757,7 @@
     <w:name w:val="Titel Titelseite"/>
     <w:basedOn w:val="Standard"/>
     <w:qFormat/>
-    <w:rsid w:val="00AB36B3"/>
+    <w:rsid w:val="00A13DF3"/>
     <w:pPr>
       <w:pBdr>
         <w:top w:val="single" w:sz="4" w:space="6" w:color="auto"/>
@@ -5970,7 +5774,7 @@
     <w:basedOn w:val="Standard"/>
     <w:uiPriority w:val="34"/>
     <w:qFormat/>
-    <w:rsid w:val="00AB36B3"/>
+    <w:rsid w:val="00A13DF3"/>
     <w:pPr>
       <w:ind w:left="720"/>
       <w:contextualSpacing/>
@@ -5980,7 +5784,7 @@
     <w:name w:val="Template"/>
     <w:basedOn w:val="NormaleTabelle"/>
     <w:uiPriority w:val="99"/>
-    <w:rsid w:val="00AB36B3"/>
+    <w:rsid w:val="00A13DF3"/>
     <w:rPr>
       <w:rFonts w:ascii="Arial" w:hAnsi="Arial"/>
     </w:rPr>
@@ -5994,10 +5798,10 @@
   <w:style w:type="paragraph" w:styleId="Aufzhlungszeichen">
     <w:name w:val="List Bullet"/>
     <w:basedOn w:val="Standard"/>
-    <w:rsid w:val="00AB36B3"/>
+    <w:rsid w:val="00A13DF3"/>
     <w:pPr>
       <w:numPr>
-        <w:numId w:val="21"/>
+        <w:numId w:val="12"/>
       </w:numPr>
       <w:contextualSpacing/>
     </w:pPr>
@@ -6007,7 +5811,7 @@
     <w:basedOn w:val="Absatz-Standardschriftart"/>
     <w:uiPriority w:val="99"/>
     <w:semiHidden/>
-    <w:rsid w:val="00AB36B3"/>
+    <w:rsid w:val="00A13DF3"/>
     <w:rPr>
       <w:color w:val="808080"/>
     </w:rPr>
@@ -6016,7 +5820,7 @@
     <w:name w:val="Tabelle grau liniert"/>
     <w:basedOn w:val="NormaleTabelle"/>
     <w:uiPriority w:val="99"/>
-    <w:rsid w:val="00AB36B3"/>
+    <w:rsid w:val="00A13DF3"/>
     <w:pPr>
       <w:spacing w:line="260" w:lineRule="atLeast"/>
     </w:pPr>
@@ -6103,10 +5907,10 @@
     <w:name w:val="Auflistung mit Kleinbuchstaben"/>
     <w:basedOn w:val="Standard"/>
     <w:qFormat/>
-    <w:rsid w:val="00AB36B3"/>
+    <w:rsid w:val="00A13DF3"/>
     <w:pPr>
       <w:numPr>
-        <w:numId w:val="16"/>
+        <w:numId w:val="7"/>
       </w:numPr>
     </w:pPr>
     <w:rPr>
@@ -6118,10 +5922,10 @@
     <w:name w:val="Auflistung mit Kleinbuchstaben Gesetze"/>
     <w:basedOn w:val="Standard"/>
     <w:qFormat/>
-    <w:rsid w:val="00AB36B3"/>
+    <w:rsid w:val="00A13DF3"/>
     <w:pPr>
       <w:numPr>
-        <w:numId w:val="17"/>
+        <w:numId w:val="8"/>
       </w:numPr>
       <w:ind w:right="1134"/>
     </w:pPr>
@@ -6133,7 +5937,7 @@
     <w:name w:val="Gesetzestexte"/>
     <w:basedOn w:val="Standard"/>
     <w:qFormat/>
-    <w:rsid w:val="00AB36B3"/>
+    <w:rsid w:val="00A13DF3"/>
     <w:pPr>
       <w:spacing w:after="60" w:line="240" w:lineRule="atLeast"/>
       <w:ind w:left="284" w:right="1134"/>
@@ -6147,7 +5951,7 @@
     <w:name w:val="Absender Distanz"/>
     <w:basedOn w:val="Standard"/>
     <w:next w:val="AbsenderText"/>
-    <w:rsid w:val="00AB36B3"/>
+    <w:rsid w:val="00A13DF3"/>
     <w:pPr>
       <w:spacing w:after="120" w:line="240" w:lineRule="auto"/>
     </w:pPr>
@@ -6160,7 +5964,7 @@
     <w:name w:val="Linie unten"/>
     <w:basedOn w:val="Blocktext"/>
     <w:qFormat/>
-    <w:rsid w:val="00AB36B3"/>
+    <w:rsid w:val="00A13DF3"/>
     <w:pPr>
       <w:pBdr>
         <w:bottom w:val="single" w:sz="4" w:space="5" w:color="auto"/>
@@ -6171,7 +5975,7 @@
     <w:name w:val="Linie oben"/>
     <w:basedOn w:val="Standard"/>
     <w:qFormat/>
-    <w:rsid w:val="00AB36B3"/>
+    <w:rsid w:val="00A13DF3"/>
     <w:pPr>
       <w:pBdr>
         <w:top w:val="single" w:sz="4" w:space="3" w:color="auto"/>
@@ -6182,7 +5986,7 @@
     <w:name w:val="Absender Text Zchn"/>
     <w:basedOn w:val="Absatz-Standardschriftart"/>
     <w:link w:val="AbsenderText"/>
-    <w:rsid w:val="00AB36B3"/>
+    <w:rsid w:val="00A13DF3"/>
     <w:rPr>
       <w:rFonts w:ascii="Arial" w:hAnsi="Arial"/>
       <w:sz w:val="16"/>
@@ -6193,7 +5997,7 @@
     <w:name w:val="Anrede Zchn"/>
     <w:basedOn w:val="Absatz-Standardschriftart"/>
     <w:link w:val="Anrede"/>
-    <w:rsid w:val="00AB36B3"/>
+    <w:rsid w:val="00A13DF3"/>
     <w:rPr>
       <w:rFonts w:ascii="Arial" w:hAnsi="Arial"/>
       <w:szCs w:val="24"/>
@@ -6203,7 +6007,7 @@
     <w:name w:val="Datum Zchn"/>
     <w:basedOn w:val="Absatz-Standardschriftart"/>
     <w:link w:val="Datum"/>
-    <w:rsid w:val="00AB36B3"/>
+    <w:rsid w:val="00A13DF3"/>
     <w:rPr>
       <w:rFonts w:ascii="Arial" w:hAnsi="Arial"/>
       <w:szCs w:val="24"/>
@@ -6213,7 +6017,7 @@
     <w:name w:val="Dokumentstruktur Zchn"/>
     <w:basedOn w:val="Absatz-Standardschriftart"/>
     <w:link w:val="Dokumentstruktur"/>
-    <w:rsid w:val="00AB36B3"/>
+    <w:rsid w:val="00A13DF3"/>
     <w:rPr>
       <w:rFonts w:ascii="Arial" w:hAnsi="Arial" w:cs="Tahoma"/>
     </w:rPr>
@@ -6222,7 +6026,7 @@
     <w:name w:val="Endnotentext Zchn"/>
     <w:basedOn w:val="Absatz-Standardschriftart"/>
     <w:link w:val="Endnotentext"/>
-    <w:rsid w:val="00AB36B3"/>
+    <w:rsid w:val="00A13DF3"/>
     <w:rPr>
       <w:rFonts w:ascii="Arial" w:hAnsi="Arial"/>
       <w:sz w:val="14"/>
@@ -6232,7 +6036,7 @@
     <w:name w:val="Fuß/-Endnotenüberschrift Zchn"/>
     <w:basedOn w:val="Absatz-Standardschriftart"/>
     <w:link w:val="Fu-Endnotenberschrift"/>
-    <w:rsid w:val="00AB36B3"/>
+    <w:rsid w:val="00A13DF3"/>
     <w:rPr>
       <w:rFonts w:ascii="Arial" w:hAnsi="Arial"/>
       <w:szCs w:val="24"/>
@@ -6242,7 +6046,7 @@
     <w:name w:val="Fußnotentext Zchn"/>
     <w:basedOn w:val="Absatz-Standardschriftart"/>
     <w:link w:val="Funotentext"/>
-    <w:rsid w:val="00AB36B3"/>
+    <w:rsid w:val="00A13DF3"/>
     <w:rPr>
       <w:rFonts w:ascii="Arial" w:hAnsi="Arial"/>
       <w:sz w:val="14"/>
@@ -6252,7 +6056,7 @@
     <w:name w:val="Fußzeile Zchn"/>
     <w:basedOn w:val="Absatz-Standardschriftart"/>
     <w:link w:val="Fuzeile"/>
-    <w:rsid w:val="00AB36B3"/>
+    <w:rsid w:val="00A13DF3"/>
     <w:rPr>
       <w:rFonts w:ascii="Arial" w:hAnsi="Arial"/>
       <w:sz w:val="16"/>
@@ -6263,7 +6067,7 @@
     <w:name w:val="Grußformel Zchn"/>
     <w:basedOn w:val="Absatz-Standardschriftart"/>
     <w:link w:val="Gruformel"/>
-    <w:rsid w:val="00AB36B3"/>
+    <w:rsid w:val="00A13DF3"/>
     <w:rPr>
       <w:rFonts w:ascii="Arial" w:hAnsi="Arial"/>
       <w:szCs w:val="24"/>
@@ -6273,7 +6077,7 @@
     <w:name w:val="HTML Adresse Zchn"/>
     <w:basedOn w:val="Absatz-Standardschriftart"/>
     <w:link w:val="HTMLAdresse"/>
-    <w:rsid w:val="00AB36B3"/>
+    <w:rsid w:val="00A13DF3"/>
     <w:rPr>
       <w:rFonts w:ascii="Arial" w:hAnsi="Arial"/>
       <w:iCs/>
@@ -6284,7 +6088,7 @@
     <w:name w:val="HTML Vorformatiert Zchn"/>
     <w:basedOn w:val="Absatz-Standardschriftart"/>
     <w:link w:val="HTMLVorformatiert"/>
-    <w:rsid w:val="00AB36B3"/>
+    <w:rsid w:val="00A13DF3"/>
     <w:rPr>
       <w:rFonts w:ascii="Arial" w:hAnsi="Arial" w:cs="Courier New"/>
     </w:rPr>
@@ -6293,7 +6097,7 @@
     <w:name w:val="Überschrift 1 Zchn"/>
     <w:basedOn w:val="Absatz-Standardschriftart"/>
     <w:link w:val="berschrift1"/>
-    <w:rsid w:val="00AB36B3"/>
+    <w:rsid w:val="00A13DF3"/>
     <w:rPr>
       <w:rFonts w:ascii="Arial" w:hAnsi="Arial" w:cs="Arial"/>
       <w:b/>
@@ -6306,7 +6110,7 @@
     <w:name w:val="Kommentartext Zchn"/>
     <w:basedOn w:val="Absatz-Standardschriftart"/>
     <w:link w:val="Kommentartext"/>
-    <w:rsid w:val="00AB36B3"/>
+    <w:rsid w:val="00A13DF3"/>
     <w:rPr>
       <w:rFonts w:ascii="Arial" w:hAnsi="Arial"/>
       <w:sz w:val="14"/>
@@ -6316,7 +6120,7 @@
     <w:name w:val="Kommentarthema Zchn"/>
     <w:basedOn w:val="KommentartextZchn"/>
     <w:link w:val="Kommentarthema"/>
-    <w:rsid w:val="00AB36B3"/>
+    <w:rsid w:val="00A13DF3"/>
     <w:rPr>
       <w:rFonts w:ascii="Arial" w:hAnsi="Arial"/>
       <w:b/>
@@ -6328,7 +6132,7 @@
     <w:name w:val="Kopfzeile Zchn"/>
     <w:basedOn w:val="Absatz-Standardschriftart"/>
     <w:link w:val="Kopfzeile"/>
-    <w:rsid w:val="00AB36B3"/>
+    <w:rsid w:val="00A13DF3"/>
     <w:rPr>
       <w:rFonts w:ascii="Arial" w:hAnsi="Arial"/>
       <w:sz w:val="17"/>
@@ -6339,7 +6143,7 @@
     <w:name w:val="Makrotext Zchn"/>
     <w:basedOn w:val="Absatz-Standardschriftart"/>
     <w:link w:val="Makrotext"/>
-    <w:rsid w:val="00AB36B3"/>
+    <w:rsid w:val="00A13DF3"/>
     <w:rPr>
       <w:rFonts w:ascii="Verdana" w:hAnsi="Verdana" w:cs="Courier New"/>
       <w:sz w:val="22"/>
@@ -6349,7 +6153,7 @@
     <w:name w:val="Nachrichtenkopf Zchn"/>
     <w:basedOn w:val="Absatz-Standardschriftart"/>
     <w:link w:val="Nachrichtenkopf"/>
-    <w:rsid w:val="00AB36B3"/>
+    <w:rsid w:val="00A13DF3"/>
     <w:rPr>
       <w:rFonts w:ascii="Arial" w:hAnsi="Arial" w:cs="Arial"/>
       <w:b/>
@@ -6360,7 +6164,7 @@
     <w:name w:val="Nur Text Zchn"/>
     <w:basedOn w:val="Absatz-Standardschriftart"/>
     <w:link w:val="NurText"/>
-    <w:rsid w:val="00AB36B3"/>
+    <w:rsid w:val="00A13DF3"/>
     <w:rPr>
       <w:rFonts w:ascii="Arial" w:hAnsi="Arial" w:cs="Courier New"/>
     </w:rPr>
@@ -6369,7 +6173,7 @@
     <w:name w:val="Sprechblasentext Zchn"/>
     <w:basedOn w:val="Absatz-Standardschriftart"/>
     <w:link w:val="Sprechblasentext"/>
-    <w:rsid w:val="00AB36B3"/>
+    <w:rsid w:val="00A13DF3"/>
     <w:rPr>
       <w:rFonts w:ascii="Arial" w:hAnsi="Arial" w:cs="Tahoma"/>
       <w:sz w:val="14"/>
@@ -6380,7 +6184,7 @@
     <w:name w:val="Textkörper Zchn"/>
     <w:basedOn w:val="Absatz-Standardschriftart"/>
     <w:link w:val="Textkrper"/>
-    <w:rsid w:val="00AB36B3"/>
+    <w:rsid w:val="00A13DF3"/>
     <w:rPr>
       <w:rFonts w:ascii="Arial" w:hAnsi="Arial"/>
       <w:szCs w:val="24"/>
@@ -6390,7 +6194,7 @@
     <w:name w:val="Textkörper 2 Zchn"/>
     <w:basedOn w:val="Absatz-Standardschriftart"/>
     <w:link w:val="Textkrper2"/>
-    <w:rsid w:val="00AB36B3"/>
+    <w:rsid w:val="00A13DF3"/>
     <w:rPr>
       <w:rFonts w:ascii="Arial" w:hAnsi="Arial"/>
       <w:szCs w:val="24"/>
@@ -6400,7 +6204,7 @@
     <w:name w:val="Textkörper 3 Zchn"/>
     <w:basedOn w:val="Absatz-Standardschriftart"/>
     <w:link w:val="Textkrper3"/>
-    <w:rsid w:val="00AB36B3"/>
+    <w:rsid w:val="00A13DF3"/>
     <w:rPr>
       <w:rFonts w:ascii="Arial" w:hAnsi="Arial"/>
       <w:szCs w:val="16"/>
@@ -6410,7 +6214,7 @@
     <w:name w:val="Textkörper-Einzug 2 Zchn"/>
     <w:basedOn w:val="Absatz-Standardschriftart"/>
     <w:link w:val="Textkrper-Einzug2"/>
-    <w:rsid w:val="00AB36B3"/>
+    <w:rsid w:val="00A13DF3"/>
     <w:rPr>
       <w:rFonts w:ascii="Arial" w:hAnsi="Arial"/>
       <w:szCs w:val="24"/>
@@ -6420,7 +6224,7 @@
     <w:name w:val="Textkörper-Einzug 3 Zchn"/>
     <w:basedOn w:val="Absatz-Standardschriftart"/>
     <w:link w:val="Textkrper-Einzug3"/>
-    <w:rsid w:val="00AB36B3"/>
+    <w:rsid w:val="00A13DF3"/>
     <w:rPr>
       <w:rFonts w:ascii="Arial" w:hAnsi="Arial"/>
       <w:szCs w:val="16"/>
@@ -6430,7 +6234,7 @@
     <w:name w:val="Textkörper-Erstzeileneinzug Zchn"/>
     <w:basedOn w:val="TextkrperZchn"/>
     <w:link w:val="Textkrper-Erstzeileneinzug"/>
-    <w:rsid w:val="00AB36B3"/>
+    <w:rsid w:val="00A13DF3"/>
     <w:rPr>
       <w:rFonts w:ascii="Arial" w:hAnsi="Arial"/>
       <w:szCs w:val="24"/>
@@ -6440,7 +6244,7 @@
     <w:name w:val="Textkörper-Zeileneinzug Zchn"/>
     <w:basedOn w:val="Absatz-Standardschriftart"/>
     <w:link w:val="Textkrper-Zeileneinzug"/>
-    <w:rsid w:val="00AB36B3"/>
+    <w:rsid w:val="00A13DF3"/>
     <w:rPr>
       <w:rFonts w:ascii="Arial" w:hAnsi="Arial"/>
       <w:szCs w:val="24"/>
@@ -6450,7 +6254,7 @@
     <w:name w:val="Textkörper-Erstzeileneinzug 2 Zchn"/>
     <w:basedOn w:val="Textkrper-ZeileneinzugZchn"/>
     <w:link w:val="Textkrper-Erstzeileneinzug2"/>
-    <w:rsid w:val="00AB36B3"/>
+    <w:rsid w:val="00A13DF3"/>
     <w:rPr>
       <w:rFonts w:ascii="Arial" w:hAnsi="Arial"/>
       <w:szCs w:val="24"/>
@@ -6460,7 +6264,7 @@
     <w:name w:val="Titel Zchn"/>
     <w:basedOn w:val="Absatz-Standardschriftart"/>
     <w:link w:val="Titel"/>
-    <w:rsid w:val="00AB36B3"/>
+    <w:rsid w:val="00A13DF3"/>
     <w:rPr>
       <w:rFonts w:ascii="Arial" w:hAnsi="Arial" w:cs="Arial"/>
       <w:b/>
@@ -6473,7 +6277,7 @@
     <w:name w:val="Überschrift 2 Zchn"/>
     <w:basedOn w:val="Absatz-Standardschriftart"/>
     <w:link w:val="berschrift2"/>
-    <w:rsid w:val="00AB36B3"/>
+    <w:rsid w:val="00A13DF3"/>
     <w:rPr>
       <w:rFonts w:ascii="Arial" w:hAnsi="Arial" w:cs="Arial"/>
       <w:b/>
@@ -6486,7 +6290,7 @@
     <w:name w:val="Überschrift 3 Zchn"/>
     <w:basedOn w:val="Absatz-Standardschriftart"/>
     <w:link w:val="berschrift3"/>
-    <w:rsid w:val="00AB36B3"/>
+    <w:rsid w:val="00A13DF3"/>
     <w:rPr>
       <w:rFonts w:ascii="Arial" w:hAnsi="Arial" w:cs="Arial"/>
       <w:b/>
@@ -6498,7 +6302,7 @@
     <w:name w:val="Überschrift 4 Zchn"/>
     <w:basedOn w:val="Absatz-Standardschriftart"/>
     <w:link w:val="berschrift4"/>
-    <w:rsid w:val="00AB36B3"/>
+    <w:rsid w:val="00A13DF3"/>
     <w:rPr>
       <w:rFonts w:ascii="Arial" w:hAnsi="Arial"/>
       <w:b/>
@@ -6510,7 +6314,7 @@
     <w:name w:val="Überschrift 5 Zchn"/>
     <w:basedOn w:val="Absatz-Standardschriftart"/>
     <w:link w:val="berschrift5"/>
-    <w:rsid w:val="00AB36B3"/>
+    <w:rsid w:val="00A13DF3"/>
     <w:rPr>
       <w:rFonts w:ascii="Arial" w:hAnsi="Arial"/>
       <w:b/>
@@ -6523,7 +6327,7 @@
     <w:name w:val="Überschrift 6 Zchn"/>
     <w:basedOn w:val="Absatz-Standardschriftart"/>
     <w:link w:val="berschrift6"/>
-    <w:rsid w:val="00AB36B3"/>
+    <w:rsid w:val="00A13DF3"/>
     <w:rPr>
       <w:rFonts w:ascii="Arial" w:hAnsi="Arial"/>
       <w:b/>
@@ -6535,7 +6339,7 @@
     <w:name w:val="Überschrift 7 Zchn"/>
     <w:basedOn w:val="Absatz-Standardschriftart"/>
     <w:link w:val="berschrift7"/>
-    <w:rsid w:val="00AB36B3"/>
+    <w:rsid w:val="00A13DF3"/>
     <w:rPr>
       <w:rFonts w:ascii="Arial" w:hAnsi="Arial"/>
       <w:b/>
@@ -6546,7 +6350,7 @@
     <w:name w:val="Überschrift 8 Zchn"/>
     <w:basedOn w:val="Absatz-Standardschriftart"/>
     <w:link w:val="berschrift8"/>
-    <w:rsid w:val="00AB36B3"/>
+    <w:rsid w:val="00A13DF3"/>
     <w:rPr>
       <w:rFonts w:ascii="Arial" w:hAnsi="Arial"/>
       <w:b/>
@@ -6558,7 +6362,7 @@
     <w:name w:val="Überschrift 9 Zchn"/>
     <w:basedOn w:val="Absatz-Standardschriftart"/>
     <w:link w:val="berschrift9"/>
-    <w:rsid w:val="00AB36B3"/>
+    <w:rsid w:val="00A13DF3"/>
     <w:rPr>
       <w:rFonts w:ascii="Arial" w:hAnsi="Arial" w:cs="Arial"/>
       <w:b/>
@@ -6569,7 +6373,7 @@
     <w:name w:val="Unterschrift Zchn"/>
     <w:basedOn w:val="Absatz-Standardschriftart"/>
     <w:link w:val="Unterschrift"/>
-    <w:rsid w:val="00AB36B3"/>
+    <w:rsid w:val="00A13DF3"/>
     <w:rPr>
       <w:rFonts w:ascii="Arial" w:hAnsi="Arial"/>
       <w:szCs w:val="24"/>
@@ -6579,7 +6383,7 @@
     <w:name w:val="Untertitel Zchn"/>
     <w:basedOn w:val="Absatz-Standardschriftart"/>
     <w:link w:val="Untertitel"/>
-    <w:rsid w:val="00AB36B3"/>
+    <w:rsid w:val="00A13DF3"/>
     <w:rPr>
       <w:rFonts w:ascii="Arial" w:hAnsi="Arial" w:cs="Arial"/>
       <w:b/>
@@ -6608,7 +6412,6 @@
   <w:style w:type="paragraph" w:customStyle="1" w:styleId="Aufgezhlt">
     <w:name w:val="Aufgezählt"/>
     <w:basedOn w:val="AufgezhltAbsatzvor"/>
-    <w:uiPriority w:val="99"/>
     <w:rsid w:val="00AA4B03"/>
     <w:pPr>
       <w:spacing w:before="0"/>
@@ -6620,7 +6423,6 @@
   <w:style w:type="paragraph" w:customStyle="1" w:styleId="AufgezhltAbsatzvor">
     <w:name w:val="Aufgezählt_Absatz_vor"/>
     <w:basedOn w:val="Standard"/>
-    <w:uiPriority w:val="99"/>
     <w:rsid w:val="00AA4B03"/>
     <w:pPr>
       <w:numPr>
@@ -6644,7 +6446,6 @@
   <w:style w:type="paragraph" w:customStyle="1" w:styleId="Standardfett">
     <w:name w:val="Standard_fett"/>
     <w:basedOn w:val="Standard"/>
-    <w:uiPriority w:val="99"/>
     <w:rsid w:val="0067264B"/>
     <w:pPr>
       <w:adjustRightInd/>
@@ -6691,7 +6492,7 @@
     <w:name w:val="ATestNR"/>
     <w:basedOn w:val="Standard"/>
     <w:qFormat/>
-    <w:rsid w:val="00AB36B3"/>
+    <w:rsid w:val="00A13DF3"/>
     <w:pPr>
       <w:adjustRightInd/>
       <w:snapToGrid/>
@@ -6703,6 +6504,57 @@
       <w:szCs w:val="22"/>
       <w:lang w:eastAsia="en-US"/>
     </w:rPr>
+  </w:style>
+  <w:style w:type="paragraph" w:customStyle="1" w:styleId="Nummerierung">
+    <w:name w:val="Nummerierung"/>
+    <w:basedOn w:val="Standard"/>
+    <w:link w:val="NummerierungChar"/>
+    <w:rsid w:val="003F5991"/>
+    <w:pPr>
+      <w:numPr>
+        <w:numId w:val="2"/>
+      </w:numPr>
+      <w:adjustRightInd/>
+      <w:snapToGrid/>
+      <w:spacing w:before="120" w:line="271" w:lineRule="auto"/>
+    </w:pPr>
+    <w:rPr>
+      <w:sz w:val="22"/>
+      <w:szCs w:val="20"/>
+    </w:rPr>
+  </w:style>
+  <w:style w:type="character" w:customStyle="1" w:styleId="NummerierungChar">
+    <w:name w:val="Nummerierung Char"/>
+    <w:basedOn w:val="Absatz-Standardschriftart"/>
+    <w:link w:val="Nummerierung"/>
+    <w:locked/>
+    <w:rsid w:val="003F5991"/>
+    <w:rPr>
+      <w:rFonts w:ascii="Arial" w:hAnsi="Arial"/>
+      <w:sz w:val="22"/>
+    </w:rPr>
+  </w:style>
+  <w:style w:type="paragraph" w:customStyle="1" w:styleId="Nummerierung9">
+    <w:name w:val="Nummerierung_9"/>
+    <w:basedOn w:val="Standard"/>
+    <w:rsid w:val="002E69A9"/>
+    <w:pPr>
+      <w:numPr>
+        <w:numId w:val="3"/>
+      </w:numPr>
+      <w:tabs>
+        <w:tab w:val="left" w:pos="284"/>
+      </w:tabs>
+    </w:pPr>
+    <w:rPr>
+      <w:rFonts w:cs="Arial"/>
+      <w:sz w:val="18"/>
+    </w:rPr>
+  </w:style>
+  <w:style w:type="paragraph" w:customStyle="1" w:styleId="Verteiler">
+    <w:name w:val="Verteiler"/>
+    <w:basedOn w:val="Aufzhlungszeichen"/>
+    <w:rsid w:val="00CE1E63"/>
   </w:style>
 </w:styles>
 </file>
@@ -7004,17 +6856,8 @@
 </file>
 
 <file path=customXml/item2.xml><?xml version="1.0" encoding="utf-8"?>
-<?mso-contentType ?>
-<FormTemplates xmlns="http://schemas.microsoft.com/sharepoint/v3/contenttype/forms">
-  <Display>DocumentLibraryForm</Display>
-  <Edit>DocumentLibraryForm</Edit>
-  <New>DocumentLibraryForm</New>
-</FormTemplates>
-</file>
-
-<file path=customXml/item3.xml><?xml version="1.0" encoding="utf-8"?>
-<ct:contentTypeSchema xmlns:ct="http://schemas.microsoft.com/office/2006/metadata/contentType" xmlns:ma="http://schemas.microsoft.com/office/2006/metadata/properties/metaAttributes" ct:_="" ma:_="" ma:contentTypeName="Dokument" ma:contentTypeID="0x010100D7FFFCF5F95BC94D9B7DF34B9D0CF76C" ma:contentTypeVersion="14" ma:contentTypeDescription="Ein neues Dokument erstellen." ma:contentTypeScope="" ma:versionID="d5365c3f292752060d21556f4c3719e0">
-  <xsd:schema xmlns:xsd="http://www.w3.org/2001/XMLSchema" xmlns:xs="http://www.w3.org/2001/XMLSchema" xmlns:p="http://schemas.microsoft.com/office/2006/metadata/properties" xmlns:ns2="5e238f3b-cf1c-4dc8-b1c3-14677632393c" xmlns:ns3="a7360a35-2516-4210-888a-7cc8dd0a384d" xmlns:ns4="fb274a4b-4ecf-4ae2-a446-66548455045d" targetNamespace="http://schemas.microsoft.com/office/2006/metadata/properties" ma:root="true" ma:fieldsID="4c397c0aac1409cd54cc6313488923be" ns2:_="" ns3:_="" ns4:_="">
+<ct:contentTypeSchema xmlns:ct="http://schemas.microsoft.com/office/2006/metadata/contentType" xmlns:ma="http://schemas.microsoft.com/office/2006/metadata/properties/metaAttributes" ct:_="" ma:_="" ma:contentTypeName="Dokument" ma:contentTypeID="0x010100D7FFFCF5F95BC94D9B7DF34B9D0CF76C" ma:contentTypeVersion="15" ma:contentTypeDescription="Ein neues Dokument erstellen." ma:contentTypeScope="" ma:versionID="1c17130d625ffd599fb21964333a98e4">
+  <xsd:schema xmlns:xsd="http://www.w3.org/2001/XMLSchema" xmlns:xs="http://www.w3.org/2001/XMLSchema" xmlns:p="http://schemas.microsoft.com/office/2006/metadata/properties" xmlns:ns2="5e238f3b-cf1c-4dc8-b1c3-14677632393c" xmlns:ns3="a7360a35-2516-4210-888a-7cc8dd0a384d" xmlns:ns4="fb274a4b-4ecf-4ae2-a446-66548455045d" targetNamespace="http://schemas.microsoft.com/office/2006/metadata/properties" ma:root="true" ma:fieldsID="3bb02f25a56f8c7106b9adb62de2c006" ns2:_="" ns3:_="" ns4:_="">
     <xsd:import namespace="5e238f3b-cf1c-4dc8-b1c3-14677632393c"/>
     <xsd:import namespace="a7360a35-2516-4210-888a-7cc8dd0a384d"/>
     <xsd:import namespace="fb274a4b-4ecf-4ae2-a446-66548455045d"/>
@@ -7037,6 +6880,7 @@
                 <xsd:element ref="ns2:MediaServiceEventHashCode" minOccurs="0"/>
                 <xsd:element ref="ns2:MediaServiceSearchProperties" minOccurs="0"/>
                 <xsd:element ref="ns2:MediaLengthInSeconds" minOccurs="0"/>
+                <xsd:element ref="ns2:MediaServiceLocation" minOccurs="0"/>
               </xsd:all>
             </xsd:complexType>
           </xsd:element>
@@ -7099,6 +6943,11 @@
     <xsd:element name="MediaLengthInSeconds" ma:index="21" nillable="true" ma:displayName="MediaLengthInSeconds" ma:hidden="true" ma:internalName="MediaLengthInSeconds" ma:readOnly="true">
       <xsd:simpleType>
         <xsd:restriction base="dms:Unknown"/>
+      </xsd:simpleType>
+    </xsd:element>
+    <xsd:element name="MediaServiceLocation" ma:index="22" nillable="true" ma:displayName="Location" ma:indexed="true" ma:internalName="MediaServiceLocation" ma:readOnly="true">
+      <xsd:simpleType>
+        <xsd:restriction base="dms:Text"/>
       </xsd:simpleType>
     </xsd:element>
   </xsd:schema>
@@ -7246,12 +7095,21 @@
 </ct:contentTypeSchema>
 </file>
 
+<file path=customXml/item3.xml><?xml version="1.0" encoding="utf-8"?>
+<?mso-contentType ?>
+<FormTemplates xmlns="http://schemas.microsoft.com/sharepoint/v3/contenttype/forms">
+  <Display>DocumentLibraryForm</Display>
+  <Edit>DocumentLibraryForm</Edit>
+  <New>DocumentLibraryForm</New>
+</FormTemplates>
+</file>
+
 <file path=customXml/item4.xml><?xml version="1.0" encoding="utf-8"?>
 <b:Sources xmlns:b="http://schemas.openxmlformats.org/officeDocument/2006/bibliography" xmlns="http://schemas.openxmlformats.org/officeDocument/2006/bibliography" SelectedStyle="\APA.XSL" StyleName="APA"/>
 </file>
 
 <file path=customXml/itemProps1.xml><?xml version="1.0" encoding="utf-8"?>
-<ds:datastoreItem xmlns:ds="http://schemas.openxmlformats.org/officeDocument/2006/customXml" ds:itemID="{96C73239-521B-4F7C-9855-7ADC3C926E1C}">
+<ds:datastoreItem xmlns:ds="http://schemas.openxmlformats.org/officeDocument/2006/customXml" ds:itemID="{B5289007-9E39-4348-9F10-8EDA20DA4CDC}">
   <ds:schemaRefs>
     <ds:schemaRef ds:uri="http://purl.org/dc/elements/1.1/"/>
     <ds:schemaRef ds:uri="http://schemas.microsoft.com/office/2006/metadata/properties"/>
@@ -7269,19 +7127,35 @@
 </file>
 
 <file path=customXml/itemProps2.xml><?xml version="1.0" encoding="utf-8"?>
-<ds:datastoreItem xmlns:ds="http://schemas.openxmlformats.org/officeDocument/2006/customXml" ds:itemID="{F1E68F9D-0ED9-463F-A912-9C626B353434}">
+<ds:datastoreItem xmlns:ds="http://schemas.openxmlformats.org/officeDocument/2006/customXml" ds:itemID="{1854ED2A-387D-4863-A1ED-C67F338C955E}">
+  <ds:schemaRefs>
+    <ds:schemaRef ds:uri="http://schemas.microsoft.com/office/2006/metadata/contentType"/>
+    <ds:schemaRef ds:uri="http://schemas.microsoft.com/office/2006/metadata/properties/metaAttributes"/>
+    <ds:schemaRef ds:uri="http://www.w3.org/2001/XMLSchema"/>
+    <ds:schemaRef ds:uri="http://schemas.microsoft.com/office/2006/metadata/properties"/>
+    <ds:schemaRef ds:uri="5e238f3b-cf1c-4dc8-b1c3-14677632393c"/>
+    <ds:schemaRef ds:uri="a7360a35-2516-4210-888a-7cc8dd0a384d"/>
+    <ds:schemaRef ds:uri="fb274a4b-4ecf-4ae2-a446-66548455045d"/>
+    <ds:schemaRef ds:uri="http://schemas.microsoft.com/office/2006/documentManagement/types"/>
+    <ds:schemaRef ds:uri="http://schemas.microsoft.com/office/infopath/2007/PartnerControls"/>
+    <ds:schemaRef ds:uri="http://schemas.openxmlformats.org/package/2006/metadata/core-properties"/>
+    <ds:schemaRef ds:uri="http://purl.org/dc/elements/1.1/"/>
+    <ds:schemaRef ds:uri="http://purl.org/dc/terms/"/>
+    <ds:schemaRef ds:uri="http://schemas.microsoft.com/internal/obd"/>
+  </ds:schemaRefs>
+</ds:datastoreItem>
+</file>
+
+<file path=customXml/itemProps3.xml><?xml version="1.0" encoding="utf-8"?>
+<ds:datastoreItem xmlns:ds="http://schemas.openxmlformats.org/officeDocument/2006/customXml" ds:itemID="{74C69B97-D762-4A64-B97E-F00C3E3E3324}">
   <ds:schemaRefs>
     <ds:schemaRef ds:uri="http://schemas.microsoft.com/sharepoint/v3/contenttype/forms"/>
   </ds:schemaRefs>
 </ds:datastoreItem>
 </file>
 
-<file path=customXml/itemProps3.xml><?xml version="1.0" encoding="utf-8"?>
-<ds:datastoreItem xmlns:ds="http://schemas.openxmlformats.org/officeDocument/2006/customXml" ds:itemID="{96394B6B-A0B2-4206-9C8D-2C4F53C2DED1}"/>
-</file>
-
 <file path=customXml/itemProps4.xml><?xml version="1.0" encoding="utf-8"?>
-<ds:datastoreItem xmlns:ds="http://schemas.openxmlformats.org/officeDocument/2006/customXml" ds:itemID="{F9EBF162-CD45-4EE2-8019-3B301B11C632}">
+<ds:datastoreItem xmlns:ds="http://schemas.openxmlformats.org/officeDocument/2006/customXml" ds:itemID="{FF73DAE5-F4BC-4CF5-8AD3-856067E94836}">
   <ds:schemaRefs>
     <ds:schemaRef ds:uri="http://schemas.openxmlformats.org/officeDocument/2006/bibliography"/>
   </ds:schemaRefs>

</xml_diff>